<commit_message>
focus on population-level fitting
</commit_message>
<xml_diff>
--- a/docs/index.docx
+++ b/docs/index.docx
@@ -111,7 +111,7 @@
       </w:r>
     </w:p>
     <w:bookmarkEnd w:id="21"/>
-    <w:bookmarkStart w:id="219" w:name="firstheader"/>
+    <w:bookmarkStart w:id="221" w:name="firstheader"/>
     <w:p>
       <w:pPr>
         <w:pStyle w:val="Heading1"/>
@@ -487,7 +487,13 @@
         <w:t xml:space="preserve"> </w:t>
       </w:r>
       <w:r>
-        <w:t xml:space="preserve">Emotionality is represented as a source context dimension. Emotional items share a common emotional source context and neutral items share a distinct neutral source context, so that recalling an item from either category promotes further recall of items from the same category.</w:t>
+        <w:t xml:space="preserve">Emotionality is represented as a source context dimension.</w:t>
+      </w:r>
+      <w:r>
+        <w:t xml:space="preserve"> </w:t>
+      </w:r>
+      <w:r>
+        <w:t xml:space="preserve">Emotional items share a common emotional source context and neutral items share a distinct neutral source context, so that recalling an item from either category promotes further recall of items from the same category.</w:t>
       </w:r>
       <w:r>
         <w:t xml:space="preserve"> </w:t>
@@ -812,7 +818,7 @@
         <w:t xml:space="preserve"> </w:t>
       </w:r>
       <w:r>
-        <w:t xml:space="preserve">However, to constrain individual participants’ model parameters, the LPP must also differentiate emotional from neutral processing at the individual level.</w:t>
+        <w:t xml:space="preserve">However, for the LPP to serve as a useful candidate marker of emotional encoding, it must also differentiate emotional from neutral processing at the individual level.</w:t>
       </w:r>
       <w:r>
         <w:t xml:space="preserve"> </w:t>
@@ -1396,7 +1402,19 @@
         <w:pStyle w:val="BodyText"/>
       </w:pPr>
       <w:r>
-        <w:t xml:space="preserve">Finally, we used these results to constrain a process model of memory encoding and retrieval.</w:t>
+        <w:t xml:space="preserve">Establishing that the LPP is a reliable and behaviorally relevant signal at the individual and trial level is a necessary precondition for using it as a model input.</w:t>
+      </w:r>
+      <w:r>
+        <w:t xml:space="preserve"> </w:t>
+      </w:r>
+      <w:r>
+        <w:t xml:space="preserve">The question of whether it actually improves model predictions was tested separately at the population level.</w:t>
+      </w:r>
+      <w:r>
+        <w:t xml:space="preserve"> </w:t>
+      </w:r>
+      <w:r>
+        <w:t xml:space="preserve">We used these results to constrain a process model of memory encoding and retrieval.</w:t>
       </w:r>
       <w:r>
         <w:t xml:space="preserve"> </w:t>
@@ -1426,16 +1444,19 @@
         <w:t xml:space="preserve"> </w:t>
       </w:r>
       <w:r>
-        <w:t xml:space="preserve">The comparison tests whether trial-level LPP can substitute for category labels, whether embedding the LPP in a mechanistic retrieval model improves prediction beyond what category labels alone provide, and whether the resulting model generates qualitatively distinct predictions about neural-behavioral relationships.</w:t>
-      </w:r>
-      <w:r>
-        <w:t xml:space="preserve"> </w:t>
-      </w:r>
-      <w:r>
-        <w:t xml:space="preserve"> </w:t>
-      </w:r>
-      <w:r>
-        <w:t xml:space="preserve">Because the cognitive model is fit to each participant independently, it can reveal whether the LPP’s contribution to prediction is consistent across individuals or concentrated in a subset.</w:t>
+        <w:t xml:space="preserve">The comparison tests whether trial-level LPP can substitute for category labels and whether embedding the LPP in a mechanistic retrieval model improves prediction beyond what category labels alone provide.</w:t>
+      </w:r>
+      <w:r>
+        <w:t xml:space="preserve"> </w:t>
+      </w:r>
+      <w:r>
+        <w:t xml:space="preserve">We also examine whether the resulting model generates qualitatively distinct predictions about neural-behavioral relationships.</w:t>
+      </w:r>
+      <w:r>
+        <w:t xml:space="preserve"> </w:t>
+      </w:r>
+      <w:r>
+        <w:t xml:space="preserve">We assess each model’s population-level predictive validity using pooled fits and examine subject-wise fits secondarily to characterize individual heterogeneity.</w:t>
       </w:r>
     </w:p>
     <w:p>
@@ -1776,9 +1797,6 @@
       </w:r>
       <w:r>
         <w:t xml:space="preserve">The neutral condition was divided into semantically unrelated and semantically related neutral pictures in the original study, but they were collapsed in this secondary data analysis to increase the number of trials in the neutral condition.</w:t>
-      </w:r>
-      <w:r>
-        <w:t xml:space="preserve"> </w:t>
       </w:r>
     </w:p>
     <w:bookmarkEnd w:id="24"/>
@@ -5490,13 +5508,13 @@
         <w:t xml:space="preserve"> </w:t>
       </w:r>
       <w:r>
-        <w:t xml:space="preserve">To simplify model evaluation, we omit an explicit termination mechanism; instead, we match each trial’s observed output length during simulation.</w:t>
-      </w:r>
-      <w:r>
-        <w:t xml:space="preserve"> </w:t>
-      </w:r>
-      <w:r>
-        <w:t xml:space="preserve">Model evaluation thus focuses on predicting the composition of recall sets across trials.</w:t>
+        <w:t xml:space="preserve">We omit an explicit termination mechanism and instead match each trial’s observed output length during simulation.</w:t>
+      </w:r>
+      <w:r>
+        <w:t xml:space="preserve"> </w:t>
+      </w:r>
+      <w:r>
+        <w:t xml:space="preserve">Conditioning on observed output length isolates the model’s predictions about which items are recalled from predictions about how many, which is appropriate because our primary behavioral outcomes and benchmarks target item selection rather than stopping behavior.</w:t>
       </w:r>
       <w:r>
         <w:t xml:space="preserve"> </w:t>
@@ -5517,6 +5535,18 @@
       </w:pPr>
       <w:r>
         <w:t xml:space="preserve">We compare four models that cross two factors: the emotional context architecture (absent vs. present) and the information source for encoding modulation (LPP vs. category labels).</w:t>
+      </w:r>
+      <w:r>
+        <w:t xml:space="preserve"> </w:t>
+      </w:r>
+      <w:r>
+        <w:t xml:space="preserve">The model architecture represents a binary emotional-vs-neutral distinction and does not capture within-neutral semantic substructure.</w:t>
+      </w:r>
+      <w:r>
+        <w:t xml:space="preserve"> </w:t>
+      </w:r>
+      <w:r>
+        <w:t xml:space="preserve">Semantically related and unrelated neutral items were therefore collapsed (see Materials), which may compress theoretically meaningful within-neutral variation.</w:t>
       </w:r>
       <w:r>
         <w:t xml:space="preserve"> </w:t>
@@ -7091,7 +7121,7 @@
         <w:t xml:space="preserve"> </w:t>
       </w:r>
       <w:r>
-        <w:t xml:space="preserve">Because the optimizer is stochastic, we run three independent fits per participant and model variant and retain the best-performing fit.</w:t>
+        <w:t xml:space="preserve">Because the optimizer is stochastic, we run three independent fits per model variant and retain the best-performing fit.</w:t>
       </w:r>
       <w:r>
         <w:t xml:space="preserve"> </w:t>
@@ -7099,17 +7129,121 @@
       <w:r>
         <w:t xml:space="preserve">We compare models using AIC computed from the approximate set log-likelihood.</w:t>
       </w:r>
-      <w:r>
-        <w:t xml:space="preserve"> </w:t>
-      </w:r>
-      <w:r>
-        <w:t xml:space="preserve">For nested model pairs, we floor the child model’s per-subject NLL at the parent model’s value to correct for occasional optimizer failures that would otherwise violate the nesting guarantee.</w:t>
-      </w:r>
-      <w:r>
-        <w:t xml:space="preserve"> </w:t>
-      </w:r>
-      <w:r>
-        <w:t xml:space="preserve">In addition to AIC weights and pairwise</w:t>
+    </w:p>
+    <w:p>
+      <w:pPr>
+        <w:pStyle w:val="BodyText"/>
+      </w:pPr>
+      <w:r>
+        <w:t xml:space="preserve">The primary model comparisons use pooled fits, in which a single shared parameter vector is fit to all 342 trials across 38 subjects.</w:t>
+      </w:r>
+      <w:r>
+        <w:t xml:space="preserve"> </w:t>
+      </w:r>
+      <w:r>
+        <w:t xml:space="preserve">Pooled fits target population-level predictive validity.</w:t>
+      </w:r>
+      <w:r>
+        <w:t xml:space="preserve"> </w:t>
+      </w:r>
+      <w:r>
+        <w:t xml:space="preserve">They also avoid the small-sample problem that arises in subject-wise fits: with only 9 trials per subject and 9–11 free parameters, the standard AICc correction</w:t>
+      </w:r>
+      <w:r>
+        <w:t xml:space="preserve"> </w:t>
+      </w:r>
+      <w:r>
+        <w:t xml:space="preserve">(</w:t>
+      </w:r>
+      <w:hyperlink w:anchor="ref-burnham2002model">
+        <w:r>
+          <w:rPr>
+            <w:rStyle w:val="Hyperlink"/>
+          </w:rPr>
+          <w:t xml:space="preserve">Burnham &amp; Anderson, 2002</w:t>
+        </w:r>
+      </w:hyperlink>
+      <w:r>
+        <w:t xml:space="preserve">)</w:t>
+      </w:r>
+      <w:r>
+        <w:t xml:space="preserve"> </w:t>
+      </w:r>
+      <w:r>
+        <w:t xml:space="preserve">is unavailable because</w:t>
+      </w:r>
+      <w:r>
+        <w:t xml:space="preserve"> </w:t>
+      </w:r>
+      <m:oMath>
+        <m:r>
+          <m:t>n</m:t>
+        </m:r>
+        <m:r>
+          <m:rPr>
+            <m:sty m:val="p"/>
+          </m:rPr>
+          <m:t>≤</m:t>
+        </m:r>
+        <m:r>
+          <m:t>k</m:t>
+        </m:r>
+        <m:r>
+          <m:rPr>
+            <m:sty m:val="p"/>
+          </m:rPr>
+          <m:t>+</m:t>
+        </m:r>
+        <m:r>
+          <m:t>1</m:t>
+        </m:r>
+      </m:oMath>
+      <w:r>
+        <w:t xml:space="preserve">.</w:t>
+      </w:r>
+      <w:r>
+        <w:t xml:space="preserve"> </w:t>
+      </w:r>
+      <w:r>
+        <w:t xml:space="preserve">Subject-wise (no-pooling) fits are reported secondarily to characterize heterogeneity.</w:t>
+      </w:r>
+      <w:r>
+        <w:t xml:space="preserve"> </w:t>
+      </w:r>
+      <w:r>
+        <w:t xml:space="preserve">They answer a different question from pooled fits rather than the same question at different noise levels</w:t>
+      </w:r>
+      <w:r>
+        <w:t xml:space="preserve"> </w:t>
+      </w:r>
+      <w:r>
+        <w:t xml:space="preserve">(</w:t>
+      </w:r>
+      <w:hyperlink w:anchor="ref-gelman2006data">
+        <w:r>
+          <w:rPr>
+            <w:rStyle w:val="Hyperlink"/>
+          </w:rPr>
+          <w:t xml:space="preserve">Gelman &amp; Hill, 2006</w:t>
+        </w:r>
+      </w:hyperlink>
+      <w:r>
+        <w:t xml:space="preserve">)</w:t>
+      </w:r>
+      <w:r>
+        <w:t xml:space="preserve">.</w:t>
+      </w:r>
+      <w:r>
+        <w:t xml:space="preserve"> </w:t>
+      </w:r>
+      <w:r>
+        <w:t xml:space="preserve">For nested model pairs in the subject-wise analysis, we floor the child model’s per-subject NLL at the parent model’s value to correct for occasional optimizer failures that would otherwise violate the nesting guarantee.</w:t>
+      </w:r>
+      <w:r>
+        <w:t xml:space="preserve"> </w:t>
+      </w:r>
+      <w:r>
+        <w:t xml:space="preserve">Pairwise</w:t>
       </w:r>
       <w:r>
         <w:t xml:space="preserve"> </w:t>
@@ -7120,113 +7254,15 @@
         </m:r>
       </m:oMath>
       <w:r>
-        <w:t xml:space="preserve">AIC, we report Bayesian model selection [BMS;</w:t>
-      </w:r>
-      <w:r>
-        <w:t xml:space="preserve"> </w:t>
-      </w:r>
-      <w:r>
-        <w:t xml:space="preserve">Stephan et al. (</w:t>
-      </w:r>
-      <w:hyperlink w:anchor="ref-stephan2009bayesian">
-        <w:r>
-          <w:rPr>
-            <w:rStyle w:val="Hyperlink"/>
-          </w:rPr>
-          <w:t xml:space="preserve">2009</w:t>
-        </w:r>
-      </w:hyperlink>
-      <w:r>
-        <w:t xml:space="preserve">)</w:t>
-      </w:r>
-      <w:r>
-        <w:t xml:space="preserve">] with protected exceedance probabilities</w:t>
-      </w:r>
-      <w:r>
-        <w:t xml:space="preserve"> </w:t>
-      </w:r>
-      <w:r>
-        <w:t xml:space="preserve">(</w:t>
-      </w:r>
-      <w:hyperlink w:anchor="ref-rigoux2014bayesian">
-        <w:r>
-          <w:rPr>
-            <w:rStyle w:val="Hyperlink"/>
-          </w:rPr>
-          <w:t xml:space="preserve">Rigoux et al., 2014</w:t>
-        </w:r>
-      </w:hyperlink>
-      <w:r>
-        <w:t xml:space="preserve">)</w:t>
-      </w:r>
-      <w:r>
-        <w:t xml:space="preserve"> </w:t>
-      </w:r>
-      <w:r>
-        <w:t xml:space="preserve">to characterize population-level model frequencies.</w:t>
-      </w:r>
-      <w:r>
-        <w:t xml:space="preserve"> </w:t>
-      </w:r>
-      <w:r>
-        <w:t xml:space="preserve">We judge a pairwise</w:t>
-      </w:r>
-      <w:r>
-        <w:t xml:space="preserve"> </w:t>
-      </w:r>
-      <m:oMath>
-        <m:r>
-          <m:t>Δ</m:t>
-        </m:r>
-      </m:oMath>
-      <w:r>
-        <w:t xml:space="preserve">AIC advantage as reliable when its 95% CI excludes zero.</w:t>
-      </w:r>
-      <w:r>
-        <w:t xml:space="preserve"> </w:t>
-      </w:r>
-      <w:r>
-        <w:t xml:space="preserve">For BMS, an exceedance probability above .95 provides strong evidence that one model is the most frequent in the population; values near chance (</w:t>
-      </w:r>
-      <m:oMath>
-        <m:r>
-          <m:t>1</m:t>
-        </m:r>
-        <m:r>
-          <m:rPr>
-            <m:sty m:val="p"/>
-          </m:rPr>
-          <m:t>/</m:t>
-        </m:r>
-        <m:r>
-          <m:t>M</m:t>
-        </m:r>
-      </m:oMath>
-      <w:r>
-        <w:t xml:space="preserve"> </w:t>
-      </w:r>
-      <w:r>
-        <w:t xml:space="preserve">for</w:t>
-      </w:r>
-      <w:r>
-        <w:t xml:space="preserve"> </w:t>
-      </w:r>
-      <m:oMath>
-        <m:r>
-          <m:t>M</m:t>
-        </m:r>
-      </m:oMath>
-      <w:r>
-        <w:t xml:space="preserve"> </w:t>
-      </w:r>
-      <w:r>
-        <w:t xml:space="preserve">models) indicate that the data do not distinguish models at the population level.</w:t>
-      </w:r>
-      <w:r>
-        <w:t xml:space="preserve"> </w:t>
-      </w:r>
-      <w:r>
-        <w:t xml:space="preserve">We then assess qualitative adequacy by simulating each fitted model on the study lists while matching each trial’s observed output length and plotting the benchmark summaries.</w:t>
+        <w:t xml:space="preserve">AIC with 95% CIs are reported for the key subject-wise contrasts.</w:t>
+      </w:r>
+    </w:p>
+    <w:p>
+      <w:pPr>
+        <w:pStyle w:val="BodyText"/>
+      </w:pPr>
+      <w:r>
+        <w:t xml:space="preserve">We assess qualitative adequacy by simulating each fitted model on the study lists while matching each trial’s observed output length and plotting benchmark summaries.</w:t>
       </w:r>
       <w:r>
         <w:t xml:space="preserve"> </w:t>
@@ -8770,9 +8806,24 @@
     </w:p>
     <w:p>
       <w:pPr>
+        <w:pStyle w:val="Heading4"/>
+        <w:rPr>
+          <w:vanish/>
+          <w:specVanish/>
+        </w:rPr>
+      </w:pPr>
+      <w:r>
+        <w:t>Pooled Analysis.</w:t>
+      </w:r>
+      <w:r>
+        <w:t xml:space="preserve"> </w:t>
+      </w:r>
+    </w:p>
+    <w:p>
+      <w:pPr>
         <w:pStyle w:val="FirstParagraph"/>
       </w:pPr>
-      <w:hyperlink w:anchor="tbl-comparison">
+      <w:hyperlink w:anchor="tbl-pooled">
         <w:r>
           <w:rPr>
             <w:rStyle w:val="Hyperlink"/>
@@ -8784,28 +8835,13 @@
         <w:t xml:space="preserve"> </w:t>
       </w:r>
       <w:r>
-        <w:t xml:space="preserve">summarizes the four-model comparison.</w:t>
-      </w:r>
-      <w:r>
-        <w:t xml:space="preserve"> </w:t>
-      </w:r>
-      <w:r>
-        <w:t xml:space="preserve">We first tested whether eCMR’s emotional context layer and encoding-strength modulation improve prediction over CMR’s temporal-context baseline.</w:t>
-      </w:r>
-      <w:r>
-        <w:t xml:space="preserve"> </w:t>
-      </w:r>
-      <w:r>
-        <w:t xml:space="preserve">eCMR achieved strictly lower negative log-likelihood (NLL) than CMR for 89.5% of participants.</w:t>
-      </w:r>
-      <w:r>
-        <w:t xml:space="preserve"> </w:t>
-      </w:r>
-      <w:r>
-        <w:t xml:space="preserve">By AIC, this advantage was reliable, with mean</w:t>
-      </w:r>
-      <w:r>
-        <w:t xml:space="preserve"> </w:t>
+        <w:t xml:space="preserve">summarizes the primary pooled model comparison, in which a single parameter vector per model was fit to all 342 trials.</w:t>
+      </w:r>
+      <w:r>
+        <w:t xml:space="preserve"> </w:t>
+      </w:r>
+      <w:r>
+        <w:t xml:space="preserve">eCMR dominated both single-context models (</w:t>
       </w:r>
       <m:oMath>
         <m:r>
@@ -8813,58 +8849,13 @@
         </m:r>
       </m:oMath>
       <w:r>
-        <w:t xml:space="preserve">AIC (CMR</w:t>
-      </w:r>
-      <w:r>
-        <w:t xml:space="preserve"> </w:t>
-      </w:r>
-      <m:oMath>
-        <m:r>
-          <m:rPr>
-            <m:sty m:val="p"/>
-          </m:rPr>
-          <m:t>−</m:t>
-        </m:r>
-      </m:oMath>
-      <w:r>
-        <w:t xml:space="preserve"> </w:t>
-      </w:r>
-      <w:r>
-        <w:t xml:space="preserve">eCMR) = 4.06 [1.36, 6.77] and the CI excluding zero.</w:t>
-      </w:r>
-      <w:r>
-        <w:t xml:space="preserve"> </w:t>
-      </w:r>
-      <w:r>
-        <w:t xml:space="preserve">Bayesian model selection assigned CMR an exceedance probability of .009 and an expected frequency of .175 (</w:t>
-      </w:r>
-      <w:hyperlink w:anchor="tbl-comparison">
-        <w:r>
-          <w:rPr>
-            <w:rStyle w:val="Hyperlink"/>
-          </w:rPr>
-          <w:t xml:space="preserve">Table 2</w:t>
-        </w:r>
-      </w:hyperlink>
-      <w:r>
-        <w:t xml:space="preserve">), confirming that the dual-context mechanism captures meaningful structure in emotional recall beyond temporal dynamics alone.</w:t>
-      </w:r>
-    </w:p>
-    <w:p>
-      <w:pPr>
-        <w:pStyle w:val="BodyText"/>
-      </w:pPr>
-      <w:r>
-        <w:t xml:space="preserve">We next asked whether the LPP alone can account for emotional memory effects.</w:t>
-      </w:r>
-      <w:r>
-        <w:t xml:space="preserve"> </w:t>
-      </w:r>
-      <w:r>
-        <w:t xml:space="preserve">CMR+LPP achieved lower NLL than CMR for 65.8% of participants, but this improvement did not offset the AIC penalty for the additional parameter: mean</w:t>
-      </w:r>
-      <w:r>
-        <w:t xml:space="preserve"> </w:t>
+        <w:t xml:space="preserve">AIC = 67.26 over CMR, 51.46 over CMR+LPP), confirming that the dual-context mechanism captures meaningful structure in emotional recall beyond temporal dynamics alone.</w:t>
+      </w:r>
+      <w:r>
+        <w:t xml:space="preserve"> </w:t>
+      </w:r>
+      <w:r>
+        <w:t xml:space="preserve">CMR+LPP improved on CMR (</w:t>
       </w:r>
       <m:oMath>
         <m:r>
@@ -8872,69 +8863,13 @@
         </m:r>
       </m:oMath>
       <w:r>
-        <w:t xml:space="preserve">AIC (CMR</w:t>
-      </w:r>
-      <w:r>
-        <w:t xml:space="preserve"> </w:t>
-      </w:r>
-      <m:oMath>
-        <m:r>
-          <m:rPr>
-            <m:sty m:val="p"/>
-          </m:rPr>
-          <m:t>−</m:t>
-        </m:r>
-      </m:oMath>
-      <w:r>
-        <w:t xml:space="preserve"> </w:t>
-      </w:r>
-      <w:r>
-        <w:t xml:space="preserve">CMR+LPP) = 0.33 [</w:t>
-      </w:r>
-      <m:oMath>
-        <m:r>
-          <m:rPr>
-            <m:sty m:val="p"/>
-          </m:rPr>
-          <m:t>−</m:t>
-        </m:r>
-        <m:r>
-          <m:t>0.77</m:t>
-        </m:r>
-      </m:oMath>
-      <w:r>
-        <w:t xml:space="preserve">, 1.44], with the CI including zero.</w:t>
-      </w:r>
-      <w:r>
-        <w:t xml:space="preserve"> </w:t>
-      </w:r>
-      <w:r>
-        <w:t xml:space="preserve">BMS assigned CMR+LPP an expected frequency of .089 and an exceedance probability below .001 (</w:t>
-      </w:r>
-      <w:hyperlink w:anchor="tbl-comparison">
-        <w:r>
-          <w:rPr>
-            <w:rStyle w:val="Hyperlink"/>
-          </w:rPr>
-          <w:t xml:space="preserve">Table 2</w:t>
-        </w:r>
-      </w:hyperlink>
-      <w:r>
-        <w:t xml:space="preserve">).</w:t>
-      </w:r>
-      <w:r>
-        <w:t xml:space="preserve"> </w:t>
-      </w:r>
-      <w:r>
-        <w:t xml:space="preserve">The LPP carries some information about which items will be recalled, but too little per subject for one additional parameter to clear the AIC bar.</w:t>
-      </w:r>
-    </w:p>
-    <w:p>
-      <w:pPr>
-        <w:pStyle w:val="BodyText"/>
-      </w:pPr>
-      <w:r>
-        <w:t xml:space="preserve">The critical comparison pits the LPP against category labels at equal parameter cost (</w:t>
+        <w:t xml:space="preserve">AIC = 15.80), indicating that the LPP carries a population-level signal about encoding strength even without an emotional context layer.</w:t>
+      </w:r>
+      <w:r>
+        <w:t xml:space="preserve"> </w:t>
+      </w:r>
+      <w:r>
+        <w:t xml:space="preserve">However, the LPP alone cannot substitute for category labels: at equal parameter cost (</w:t>
       </w:r>
       <m:oMath>
         <m:r>
@@ -8951,19 +8886,15 @@
         </m:r>
       </m:oMath>
       <w:r>
-        <w:t xml:space="preserve">).</w:t>
-      </w:r>
-      <w:r>
-        <w:t xml:space="preserve"> </w:t>
-      </w:r>
-      <w:r>
-        <w:t xml:space="preserve">eCMR achieved lower NLL than CMR+LPP for 68.4% of participants.</w:t>
-      </w:r>
-      <w:r>
-        <w:t xml:space="preserve"> </w:t>
-      </w:r>
-      <w:r>
-        <w:t xml:space="preserve">Mean</w:t>
+        <w:t xml:space="preserve">), eCMR substantially outperformed CMR+LPP.</w:t>
+      </w:r>
+    </w:p>
+    <w:p>
+      <w:pPr>
+        <w:pStyle w:val="BodyText"/>
+      </w:pPr>
+      <w:r>
+        <w:t xml:space="preserve">LPP-eCMR achieved the best fit overall, improving on eCMR by</w:t>
       </w:r>
       <w:r>
         <w:t xml:space="preserve"> </w:t>
@@ -8974,10 +8905,90 @@
         </m:r>
       </m:oMath>
       <w:r>
-        <w:t xml:space="preserve">AIC (CMR+LPP</w:t>
-      </w:r>
-      <w:r>
-        <w:t xml:space="preserve"> </w:t>
+        <w:t xml:space="preserve">AIC = 34.16.</w:t>
+      </w:r>
+      <w:r>
+        <w:t xml:space="preserve"> </w:t>
+      </w:r>
+      <w:r>
+        <w:t xml:space="preserve">Supplementing category labels with trial-level LPP improved pooled predictive fit.</w:t>
+      </w:r>
+    </w:p>
+    <w:p>
+      <w:pPr>
+        <w:pStyle w:val="Heading4"/>
+        <w:rPr>
+          <w:vanish/>
+          <w:specVanish/>
+        </w:rPr>
+      </w:pPr>
+      <w:r>
+        <w:t>Subject-Wise Analysis.</w:t>
+      </w:r>
+      <w:r>
+        <w:t xml:space="preserve"> </w:t>
+      </w:r>
+    </w:p>
+    <w:p>
+      <w:pPr>
+        <w:pStyle w:val="BodyText"/>
+      </w:pPr>
+      <w:r>
+        <w:t xml:space="preserve">Separate subject-wise (no-pooling) fits were also examined.</w:t>
+      </w:r>
+      <w:r>
+        <w:t xml:space="preserve"> </w:t>
+      </w:r>
+      <w:r>
+        <w:t xml:space="preserve">Because each subject contributed only 9 lists for models with 9–11 free parameters, these comparisons are methodologically fragile and are not treated as the primary inferential basis; they are reported to characterize heterogeneity.</w:t>
+      </w:r>
+      <w:r>
+        <w:t xml:space="preserve"> </w:t>
+      </w:r>
+      <w:r>
+        <w:t xml:space="preserve">Nesting flooring was required for 23 of 152 subject–model entries.</w:t>
+      </w:r>
+    </w:p>
+    <w:p>
+      <w:pPr>
+        <w:pStyle w:val="BodyText"/>
+      </w:pPr>
+      <w:r>
+        <w:t xml:space="preserve">The broad ordering of models was similar, but the LPP-related gains were weak and heterogeneous at the subject level.</w:t>
+      </w:r>
+      <w:r>
+        <w:t xml:space="preserve"> </w:t>
+      </w:r>
+      <w:r>
+        <w:t xml:space="preserve">eCMR outperformed CMR (mean</w:t>
+      </w:r>
+      <w:r>
+        <w:t xml:space="preserve"> </w:t>
+      </w:r>
+      <m:oMath>
+        <m:r>
+          <m:t>Δ</m:t>
+        </m:r>
+      </m:oMath>
+      <w:r>
+        <w:t xml:space="preserve">AIC = 4.06 [1.36, 6.77]).</w:t>
+      </w:r>
+      <w:r>
+        <w:t xml:space="preserve"> </w:t>
+      </w:r>
+      <w:r>
+        <w:t xml:space="preserve">However, mean</w:t>
+      </w:r>
+      <w:r>
+        <w:t xml:space="preserve"> </w:t>
+      </w:r>
+      <m:oMath>
+        <m:r>
+          <m:t>Δ</m:t>
+        </m:r>
+      </m:oMath>
+      <w:r>
+        <w:t xml:space="preserve">AIC was 0.33 [</w:t>
       </w:r>
       <m:oMath>
         <m:r>
@@ -8986,110 +8997,12 @@
           </m:rPr>
           <m:t>−</m:t>
         </m:r>
-      </m:oMath>
-      <w:r>
-        <w:t xml:space="preserve"> </w:t>
-      </w:r>
-      <w:r>
-        <w:t xml:space="preserve">eCMR) = 3.73 [1.23, 6.22] and the CI excludes zero; the median</w:t>
-      </w:r>
-      <w:r>
-        <w:t xml:space="preserve"> </w:t>
-      </w:r>
-      <m:oMath>
         <m:r>
-          <m:t>Δ</m:t>
+          <m:t>0.77</m:t>
         </m:r>
       </m:oMath>
       <w:r>
-        <w:t xml:space="preserve">AIC = 1.52 [0.18, 2.86] also excludes zero.</w:t>
-      </w:r>
-      <w:r>
-        <w:t xml:space="preserve"> </w:t>
-      </w:r>
-      <w:r>
-        <w:t xml:space="preserve">At equal parameter cost, category labels embedded in the emotional context architecture captured substantially more variance than trial-level LPP operating through the temporal pathway.</w:t>
-      </w:r>
-    </w:p>
-    <w:p>
-      <w:pPr>
-        <w:pStyle w:val="BodyText"/>
-      </w:pPr>
-      <w:r>
-        <w:t xml:space="preserve">Turning to the LPP constraint, LPP-eCMR achieved strictly lower NLL than eCMR for 73.7% of participants, with the remainder tied after nesting flooring.</w:t>
-      </w:r>
-      <w:r>
-        <w:t xml:space="preserve"> </w:t>
-      </w:r>
-      <w:r>
-        <w:t xml:space="preserve">By aggregate AIC weights, LPP-eCMR was strongly favored (</w:t>
-      </w:r>
-      <m:oMath>
-        <m:r>
-          <m:t>w</m:t>
-        </m:r>
-      </m:oMath>
-      <w:r>
-        <w:t xml:space="preserve"> </w:t>
-      </w:r>
-      <w:r>
-        <w:t xml:space="preserve">= .997 vs .003;</w:t>
-      </w:r>
-      <w:r>
-        <w:t xml:space="preserve"> </w:t>
-      </w:r>
-      <w:hyperlink w:anchor="tbl-comparison">
-        <w:r>
-          <w:rPr>
-            <w:rStyle w:val="Hyperlink"/>
-          </w:rPr>
-          <w:t xml:space="preserve">Table 2</w:t>
-        </w:r>
-      </w:hyperlink>
-      <w:r>
-        <w:t xml:space="preserve">), and Bayesian model selection also favored LPP-eCMR (exceedance probability = .721 vs .269).</w:t>
-      </w:r>
-    </w:p>
-    <w:p>
-      <w:pPr>
-        <w:pStyle w:val="BodyText"/>
-      </w:pPr>
-      <w:r>
-        <w:t xml:space="preserve">This aggregate advantage was not uniform across individuals.</w:t>
-      </w:r>
-      <w:r>
-        <w:t xml:space="preserve"> </w:t>
-      </w:r>
-      <w:r>
-        <w:t xml:space="preserve">The mean per-subject</w:t>
-      </w:r>
-      <w:r>
-        <w:t xml:space="preserve"> </w:t>
-      </w:r>
-      <m:oMath>
-        <m:r>
-          <m:t>Δ</m:t>
-        </m:r>
-      </m:oMath>
-      <w:r>
-        <w:t xml:space="preserve">AIC (eCMR</w:t>
-      </w:r>
-      <w:r>
-        <w:t xml:space="preserve"> </w:t>
-      </w:r>
-      <m:oMath>
-        <m:r>
-          <m:rPr>
-            <m:sty m:val="p"/>
-          </m:rPr>
-          <m:t>−</m:t>
-        </m:r>
-      </m:oMath>
-      <w:r>
-        <w:t xml:space="preserve"> </w:t>
-      </w:r>
-      <w:r>
-        <w:t xml:space="preserve">LPP-eCMR) was 0.30 [</w:t>
+        <w:t xml:space="preserve">, 1.44] for CMR+LPP over CMR and 0.30 [</w:t>
       </w:r>
       <m:oMath>
         <m:r>
@@ -9103,70 +9016,22 @@
         </m:r>
       </m:oMath>
       <w:r>
-        <w:t xml:space="preserve">, 1.29], consistent with practical equivalence, and the median was</w:t>
-      </w:r>
-      <w:r>
-        <w:t xml:space="preserve"> </w:t>
-      </w:r>
-      <m:oMath>
-        <m:r>
-          <m:rPr>
-            <m:sty m:val="p"/>
-          </m:rPr>
-          <m:t>−</m:t>
-        </m:r>
-        <m:r>
-          <m:t>1.21</m:t>
-        </m:r>
-      </m:oMath>
-      <w:r>
-        <w:t xml:space="preserve"> </w:t>
-      </w:r>
-      <w:r>
-        <w:t xml:space="preserve">[</w:t>
-      </w:r>
-      <m:oMath>
-        <m:r>
-          <m:rPr>
-            <m:sty m:val="p"/>
-          </m:rPr>
-          <m:t>−</m:t>
-        </m:r>
-        <m:r>
-          <m:t>2.36</m:t>
-        </m:r>
-      </m:oMath>
-      <w:r>
-        <w:t xml:space="preserve">,</w:t>
-      </w:r>
-      <w:r>
-        <w:t xml:space="preserve"> </w:t>
-      </w:r>
-      <m:oMath>
-        <m:r>
-          <m:rPr>
-            <m:sty m:val="p"/>
-          </m:rPr>
-          <m:t>−</m:t>
-        </m:r>
-        <m:r>
-          <m:t>0.06</m:t>
-        </m:r>
-      </m:oMath>
-      <w:r>
-        <w:t xml:space="preserve">], indicating that the typical participant’s NLL improvement did not offset the penalty for the additional parameter.</w:t>
-      </w:r>
-      <w:r>
-        <w:t xml:space="preserve"> </w:t>
-      </w:r>
-      <w:r>
-        <w:t xml:space="preserve">Protected exceedance probabilities confirmed this heterogeneity, remaining at chance (.250 each).</w:t>
-      </w:r>
-      <w:r>
-        <w:t xml:space="preserve"> </w:t>
-      </w:r>
-      <w:r>
-        <w:t xml:space="preserve">Together, these results indicate that a subset of participants benefit substantially from the LPP term — enough to dominate the aggregate — while for the remainder the LPP adds little beyond what category labels already capture.</w:t>
+        <w:t xml:space="preserve">, 1.29] for LPP-eCMR over eCMR, with both CIs including zero.</w:t>
+      </w:r>
+    </w:p>
+    <w:p>
+      <w:pPr>
+        <w:pStyle w:val="Heading4"/>
+        <w:rPr>
+          <w:vanish/>
+          <w:specVanish/>
+        </w:rPr>
+      </w:pPr>
+      <w:r>
+        <w:t>Qualitative Diagnostics.</w:t>
+      </w:r>
+      <w:r>
+        <w:t xml:space="preserve"> </w:t>
       </w:r>
     </w:p>
     <w:p>
@@ -9174,68 +9039,9 @@
         <w:pStyle w:val="BodyText"/>
       </w:pPr>
       <w:r>
-        <w:t xml:space="preserve">In sum, the emotional context architecture is essential (CMR</w:t>
-      </w:r>
-      <w:r>
-        <w:t xml:space="preserve"> </w:t>
-      </w:r>
-      <m:oMath>
-        <m:r>
-          <m:rPr>
-            <m:sty m:val="p"/>
-          </m:rPr>
-          <m:t>&lt;</m:t>
-        </m:r>
-      </m:oMath>
-      <w:r>
-        <w:t xml:space="preserve"> </w:t>
-      </w:r>
-      <w:r>
-        <w:t xml:space="preserve">eCMR), the LPP cannot replace it (CMR+LPP</w:t>
-      </w:r>
-      <w:r>
-        <w:t xml:space="preserve"> </w:t>
-      </w:r>
-      <m:oMath>
-        <m:r>
-          <m:rPr>
-            <m:sty m:val="p"/>
-          </m:rPr>
-          <m:t>≈</m:t>
-        </m:r>
-      </m:oMath>
-      <w:r>
-        <w:t xml:space="preserve"> </w:t>
-      </w:r>
-      <w:r>
-        <w:t xml:space="preserve">CMR</w:t>
-      </w:r>
-      <w:r>
-        <w:t xml:space="preserve"> </w:t>
-      </w:r>
-      <m:oMath>
-        <m:r>
-          <m:rPr>
-            <m:sty m:val="p"/>
-          </m:rPr>
-          <m:t>≪</m:t>
-        </m:r>
-      </m:oMath>
-      <w:r>
-        <w:t xml:space="preserve"> </w:t>
-      </w:r>
-      <w:r>
-        <w:t xml:space="preserve">eCMR), and supplementing category labels with the LPP yields a genuine aggregate fit advantage concentrated among participants for whom the LPP carries the most information about subsequent recall.</w:t>
-      </w:r>
-    </w:p>
-    <w:p>
-      <w:pPr>
-        <w:pStyle w:val="BodyText"/>
-      </w:pPr>
-      <w:r>
         <w:t xml:space="preserve">We assessed qualitative adequacy with two benchmark diagnostics (</w:t>
       </w:r>
-      <w:hyperlink w:anchor="fig-catspc">
+      <w:hyperlink w:anchor="fig-empirical">
         <w:r>
           <w:rPr>
             <w:rStyle w:val="Hyperlink"/>
@@ -9249,7 +9055,7 @@
       <w:r>
         <w:t xml:space="preserve"> </w:t>
       </w:r>
-      <w:hyperlink w:anchor="fig-lpp-recall">
+      <w:hyperlink w:anchor="fig-catspc">
         <w:r>
           <w:rPr>
             <w:rStyle w:val="Hyperlink"/>
@@ -9258,6 +9064,20 @@
         </w:r>
       </w:hyperlink>
       <w:r>
+        <w:t xml:space="preserve">;</w:t>
+      </w:r>
+      <w:r>
+        <w:t xml:space="preserve"> </w:t>
+      </w:r>
+      <w:hyperlink w:anchor="fig-lpp-recall">
+        <w:r>
+          <w:rPr>
+            <w:rStyle w:val="Hyperlink"/>
+          </w:rPr>
+          <w:t xml:space="preserve">Figure 13</w:t>
+        </w:r>
+      </w:hyperlink>
+      <w:r>
         <w:t xml:space="preserve">).</w:t>
       </w:r>
       <w:r>
@@ -9277,7 +9097,7 @@
           <w:rPr>
             <w:rStyle w:val="Hyperlink"/>
           </w:rPr>
-          <w:t xml:space="preserve">Figure 11</w:t>
+          <w:t xml:space="preserve">Figure 12</w:t>
         </w:r>
       </w:hyperlink>
       <w:r>
@@ -9307,7 +9127,7 @@
         <w:t xml:space="preserve"> </w:t>
       </w:r>
       <w:r>
-        <w:t xml:space="preserve">Despite aggregate AIC indistinguishability between eCMR and LPP-eCMR, the models make qualitatively different predictions about an untrained summary statistic.</w:t>
+        <w:t xml:space="preserve">The two models also make different predictions about an untrained neural-behavioral summary statistic.</w:t>
       </w:r>
       <w:r>
         <w:t xml:space="preserve"> </w:t>
@@ -9338,7 +9158,7 @@
           <w:rPr>
             <w:rStyle w:val="Hyperlink"/>
           </w:rPr>
-          <w:t xml:space="preserve">Figure 12</w:t>
+          <w:t xml:space="preserve">Figure 13</w:t>
         </w:r>
       </w:hyperlink>
       <w:r>
@@ -9402,25 +9222,19 @@
         <w:pStyle w:val="BodyText"/>
       </w:pPr>
       <w:r>
-        <w:t xml:space="preserve">The LPP thus carries real information about emotional encoding strength, as demonstrated by CMR+LPP and LPP-eCMR reproducing the LPP-by-recall pattern that CMR and eCMR cannot.</w:t>
-      </w:r>
-      <w:r>
-        <w:t xml:space="preserve"> </w:t>
-      </w:r>
-      <w:r>
-        <w:t xml:space="preserve">However, the LPP alone is not a substitute for category labels: it cannot reproduce the categorical recall advantage, and its per-subject signal is small relative to the AIC cost of one parameter.</w:t>
-      </w:r>
-      <w:r>
-        <w:t xml:space="preserve"> </w:t>
-      </w:r>
-      <w:r>
-        <w:t xml:space="preserve">The value of incorporating trial-level neural measures is not in replacing existing model structure or uniformly improving fit.</w:t>
-      </w:r>
-      <w:r>
-        <w:t xml:space="preserve"> </w:t>
-      </w:r>
-      <w:r>
-        <w:t xml:space="preserve">It is in characterizing which individuals benefit from the neural constraint and in generating mechanistic predictions that were not used as fitting targets.</w:t>
+        <w:t xml:space="preserve">The LPP thus improves pooled predictive fit and generates mechanistic predictions that were not used as fitting targets.</w:t>
+      </w:r>
+      <w:r>
+        <w:t xml:space="preserve"> </w:t>
+      </w:r>
+      <w:r>
+        <w:t xml:space="preserve">However, it does not substitute for the emotional context architecture: CMR+LPP remains far behind eCMR, and subject-wise gains are small and heterogeneous under current data constraints.</w:t>
+      </w:r>
+      <w:r>
+        <w:t xml:space="preserve"> </w:t>
+      </w:r>
+      <w:r>
+        <w:t xml:space="preserve">The value of incorporating trial-level neural measures lies in the population-level predictive improvement and in generating qualitatively distinct predictions about neural-behavioral relationships.</w:t>
       </w:r>
     </w:p>
     <w:bookmarkEnd w:id="35"/>
@@ -9435,7 +9249,7 @@
       </w:r>
     </w:p>
     <w:bookmarkEnd w:id="37"/>
-    <w:bookmarkStart w:id="218" w:name="references"/>
+    <w:bookmarkStart w:id="220" w:name="references"/>
     <w:p>
       <w:pPr>
         <w:pStyle w:val="Heading2"/>
@@ -9586,13 +9400,13 @@
       </w:hyperlink>
     </w:p>
     <w:bookmarkEnd w:id="43"/>
-    <w:bookmarkStart w:id="45" w:name="ref-chun2007interactions"/>
+    <w:bookmarkStart w:id="45" w:name="ref-burnham2002model"/>
     <w:p>
       <w:pPr>
         <w:pStyle w:val="Bibliography"/>
       </w:pPr>
       <w:r>
-        <w:t xml:space="preserve">Chun, M. M., &amp; Turk-Browne, N. B. (2007). Interactions between attention and memory.</w:t>
+        <w:t xml:space="preserve">Burnham, K. P., &amp; Anderson, D. R. (2002).</w:t>
       </w:r>
       <w:r>
         <w:t xml:space="preserve"> </w:t>
@@ -9602,10 +9416,34 @@
           <w:i/>
           <w:iCs/>
         </w:rPr>
-        <w:t xml:space="preserve">Current Opinion in Neurobiology</w:t>
-      </w:r>
-      <w:r>
-        <w:t xml:space="preserve">,</w:t>
+        <w:t xml:space="preserve">Model selection and multimodel inference: A practical information-theoretic approach</w:t>
+      </w:r>
+      <w:r>
+        <w:t xml:space="preserve"> </w:t>
+      </w:r>
+      <w:r>
+        <w:t xml:space="preserve">(2nd ed.). Springer.</w:t>
+      </w:r>
+      <w:r>
+        <w:t xml:space="preserve"> </w:t>
+      </w:r>
+      <w:hyperlink r:id="rId44">
+        <w:r>
+          <w:rPr>
+            <w:rStyle w:val="Hyperlink"/>
+          </w:rPr>
+          <w:t xml:space="preserve">https://doi.org/10.1007/b97636</w:t>
+        </w:r>
+      </w:hyperlink>
+    </w:p>
+    <w:bookmarkEnd w:id="45"/>
+    <w:bookmarkStart w:id="47" w:name="ref-chun2007interactions"/>
+    <w:p>
+      <w:pPr>
+        <w:pStyle w:val="Bibliography"/>
+      </w:pPr>
+      <w:r>
+        <w:t xml:space="preserve">Chun, M. M., &amp; Turk-Browne, N. B. (2007). Interactions between attention and memory.</w:t>
       </w:r>
       <w:r>
         <w:t xml:space="preserve"> </w:t>
@@ -9615,6 +9453,19 @@
           <w:i/>
           <w:iCs/>
         </w:rPr>
+        <w:t xml:space="preserve">Current Opinion in Neurobiology</w:t>
+      </w:r>
+      <w:r>
+        <w:t xml:space="preserve">,</w:t>
+      </w:r>
+      <w:r>
+        <w:t xml:space="preserve"> </w:t>
+      </w:r>
+      <w:r>
+        <w:rPr>
+          <w:i/>
+          <w:iCs/>
+        </w:rPr>
         <w:t xml:space="preserve">17</w:t>
       </w:r>
       <w:r>
@@ -9623,7 +9474,7 @@
       <w:r>
         <w:t xml:space="preserve"> </w:t>
       </w:r>
-      <w:hyperlink r:id="rId44">
+      <w:hyperlink r:id="rId46">
         <w:r>
           <w:rPr>
             <w:rStyle w:val="Hyperlink"/>
@@ -9632,8 +9483,8 @@
         </w:r>
       </w:hyperlink>
     </w:p>
-    <w:bookmarkEnd w:id="45"/>
-    <w:bookmarkStart w:id="47" w:name="ref-cuthbert2000brain"/>
+    <w:bookmarkEnd w:id="47"/>
+    <w:bookmarkStart w:id="49" w:name="ref-cuthbert2000brain"/>
     <w:p>
       <w:pPr>
         <w:pStyle w:val="Bibliography"/>
@@ -9670,7 +9521,7 @@
       <w:r>
         <w:t xml:space="preserve"> </w:t>
       </w:r>
-      <w:hyperlink r:id="rId46">
+      <w:hyperlink r:id="rId48">
         <w:r>
           <w:rPr>
             <w:rStyle w:val="Hyperlink"/>
@@ -9679,8 +9530,8 @@
         </w:r>
       </w:hyperlink>
     </w:p>
-    <w:bookmarkEnd w:id="47"/>
-    <w:bookmarkStart w:id="49" w:name="ref-danglauser2011geneva"/>
+    <w:bookmarkEnd w:id="49"/>
+    <w:bookmarkStart w:id="51" w:name="ref-danglauser2011geneva"/>
     <w:p>
       <w:pPr>
         <w:pStyle w:val="Bibliography"/>
@@ -9723,7 +9574,7 @@
       <w:r>
         <w:t xml:space="preserve"> </w:t>
       </w:r>
-      <w:hyperlink r:id="rId48">
+      <w:hyperlink r:id="rId50">
         <w:r>
           <w:rPr>
             <w:rStyle w:val="Hyperlink"/>
@@ -9732,8 +9583,8 @@
         </w:r>
       </w:hyperlink>
     </w:p>
-    <w:bookmarkEnd w:id="49"/>
-    <w:bookmarkStart w:id="51" w:name="ref-delorme2004eeglab"/>
+    <w:bookmarkEnd w:id="51"/>
+    <w:bookmarkStart w:id="53" w:name="ref-delorme2004eeglab"/>
     <w:p>
       <w:pPr>
         <w:pStyle w:val="Bibliography"/>
@@ -9791,7 +9642,7 @@
       <w:r>
         <w:t xml:space="preserve"> </w:t>
       </w:r>
-      <w:hyperlink r:id="rId50">
+      <w:hyperlink r:id="rId52">
         <w:r>
           <w:rPr>
             <w:rStyle w:val="Hyperlink"/>
@@ -9800,8 +9651,8 @@
         </w:r>
       </w:hyperlink>
     </w:p>
-    <w:bookmarkEnd w:id="51"/>
-    <w:bookmarkStart w:id="53" w:name="ref-dolcos2002event"/>
+    <w:bookmarkEnd w:id="53"/>
+    <w:bookmarkStart w:id="55" w:name="ref-dolcos2002event"/>
     <w:p>
       <w:pPr>
         <w:pStyle w:val="Bibliography"/>
@@ -9838,7 +9689,7 @@
       <w:r>
         <w:t xml:space="preserve"> </w:t>
       </w:r>
-      <w:hyperlink r:id="rId52">
+      <w:hyperlink r:id="rId54">
         <w:r>
           <w:rPr>
             <w:rStyle w:val="Hyperlink"/>
@@ -9847,8 +9698,8 @@
         </w:r>
       </w:hyperlink>
     </w:p>
-    <w:bookmarkEnd w:id="53"/>
-    <w:bookmarkStart w:id="55" w:name="ref-fields2023p300"/>
+    <w:bookmarkEnd w:id="55"/>
+    <w:bookmarkStart w:id="57" w:name="ref-fields2023p300"/>
     <w:p>
       <w:pPr>
         <w:pStyle w:val="Bibliography"/>
@@ -9903,7 +9754,7 @@
       <w:r>
         <w:t xml:space="preserve"> </w:t>
       </w:r>
-      <w:hyperlink r:id="rId54">
+      <w:hyperlink r:id="rId56">
         <w:r>
           <w:rPr>
             <w:rStyle w:val="Hyperlink"/>
@@ -9912,8 +9763,8 @@
         </w:r>
       </w:hyperlink>
     </w:p>
-    <w:bookmarkEnd w:id="55"/>
-    <w:bookmarkStart w:id="57" w:name="ref-folkerts2018human"/>
+    <w:bookmarkEnd w:id="57"/>
+    <w:bookmarkStart w:id="59" w:name="ref-folkerts2018human"/>
     <w:p>
       <w:pPr>
         <w:pStyle w:val="Bibliography"/>
@@ -9950,7 +9801,7 @@
       <w:r>
         <w:t xml:space="preserve"> </w:t>
       </w:r>
-      <w:hyperlink r:id="rId56">
+      <w:hyperlink r:id="rId58">
         <w:r>
           <w:rPr>
             <w:rStyle w:val="Hyperlink"/>
@@ -9959,8 +9810,8 @@
         </w:r>
       </w:hyperlink>
     </w:p>
-    <w:bookmarkEnd w:id="57"/>
-    <w:bookmarkStart w:id="58" w:name="ref-fox2019companion"/>
+    <w:bookmarkEnd w:id="59"/>
+    <w:bookmarkStart w:id="60" w:name="ref-fox2019companion"/>
     <w:p>
       <w:pPr>
         <w:pStyle w:val="Bibliography"/>
@@ -10013,44 +9864,14 @@
         <w:t xml:space="preserve">(3rd ed.). Sage Publications.</w:t>
       </w:r>
     </w:p>
-    <w:bookmarkEnd w:id="58"/>
-    <w:bookmarkStart w:id="60" w:name="ref-hajcak2020significance"/>
+    <w:bookmarkEnd w:id="60"/>
+    <w:bookmarkStart w:id="62" w:name="ref-gelman2006data"/>
     <w:p>
       <w:pPr>
         <w:pStyle w:val="Bibliography"/>
       </w:pPr>
       <w:r>
-        <w:t xml:space="preserve">Hajcak, G., &amp; Foti, D. (2020). Significance?...</w:t>
-      </w:r>
-      <w:r>
-        <w:t xml:space="preserve"> </w:t>
-      </w:r>
-      <w:r>
-        <w:t xml:space="preserve">Significance</w:t>
-      </w:r>
-      <w:r>
-        <w:t xml:space="preserve">!</w:t>
-      </w:r>
-      <w:r>
-        <w:t xml:space="preserve"> </w:t>
-      </w:r>
-      <w:r>
-        <w:t xml:space="preserve">Empirical</w:t>
-      </w:r>
-      <w:r>
-        <w:t xml:space="preserve">, methodological, and theoretical connections between the late positive potential and</w:t>
-      </w:r>
-      <w:r>
-        <w:t xml:space="preserve"> </w:t>
-      </w:r>
-      <w:r>
-        <w:t xml:space="preserve">P300</w:t>
-      </w:r>
-      <w:r>
-        <w:t xml:space="preserve"> </w:t>
-      </w:r>
-      <w:r>
-        <w:t xml:space="preserve">as neural responses to stimulus significance: An integrative review.</w:t>
+        <w:t xml:space="preserve">Gelman, A., &amp; Hill, J. (2006).</w:t>
       </w:r>
       <w:r>
         <w:t xml:space="preserve"> </w:t>
@@ -10060,10 +9881,61 @@
           <w:i/>
           <w:iCs/>
         </w:rPr>
-        <w:t xml:space="preserve">Psychophysiology</w:t>
-      </w:r>
-      <w:r>
-        <w:t xml:space="preserve">,</w:t>
+        <w:t xml:space="preserve">Data analysis using regression and multilevel/hierarchical models</w:t>
+      </w:r>
+      <w:r>
+        <w:t xml:space="preserve">. Cambridge University Press.</w:t>
+      </w:r>
+      <w:r>
+        <w:t xml:space="preserve"> </w:t>
+      </w:r>
+      <w:hyperlink r:id="rId61">
+        <w:r>
+          <w:rPr>
+            <w:rStyle w:val="Hyperlink"/>
+          </w:rPr>
+          <w:t xml:space="preserve">https://doi.org/10.1017/CBO9780511790942</w:t>
+        </w:r>
+      </w:hyperlink>
+    </w:p>
+    <w:bookmarkEnd w:id="62"/>
+    <w:bookmarkStart w:id="64" w:name="ref-hajcak2020significance"/>
+    <w:p>
+      <w:pPr>
+        <w:pStyle w:val="Bibliography"/>
+      </w:pPr>
+      <w:r>
+        <w:t xml:space="preserve">Hajcak, G., &amp; Foti, D. (2020). Significance?...</w:t>
+      </w:r>
+      <w:r>
+        <w:t xml:space="preserve"> </w:t>
+      </w:r>
+      <w:r>
+        <w:t xml:space="preserve">Significance</w:t>
+      </w:r>
+      <w:r>
+        <w:t xml:space="preserve">!</w:t>
+      </w:r>
+      <w:r>
+        <w:t xml:space="preserve"> </w:t>
+      </w:r>
+      <w:r>
+        <w:t xml:space="preserve">Empirical</w:t>
+      </w:r>
+      <w:r>
+        <w:t xml:space="preserve">, methodological, and theoretical connections between the late positive potential and</w:t>
+      </w:r>
+      <w:r>
+        <w:t xml:space="preserve"> </w:t>
+      </w:r>
+      <w:r>
+        <w:t xml:space="preserve">P300</w:t>
+      </w:r>
+      <w:r>
+        <w:t xml:space="preserve"> </w:t>
+      </w:r>
+      <w:r>
+        <w:t xml:space="preserve">as neural responses to stimulus significance: An integrative review.</w:t>
       </w:r>
       <w:r>
         <w:t xml:space="preserve"> </w:t>
@@ -10073,6 +9945,19 @@
           <w:i/>
           <w:iCs/>
         </w:rPr>
+        <w:t xml:space="preserve">Psychophysiology</w:t>
+      </w:r>
+      <w:r>
+        <w:t xml:space="preserve">,</w:t>
+      </w:r>
+      <w:r>
+        <w:t xml:space="preserve"> </w:t>
+      </w:r>
+      <w:r>
+        <w:rPr>
+          <w:i/>
+          <w:iCs/>
+        </w:rPr>
         <w:t xml:space="preserve">57</w:t>
       </w:r>
       <w:r>
@@ -10081,7 +9966,7 @@
       <w:r>
         <w:t xml:space="preserve"> </w:t>
       </w:r>
-      <w:hyperlink r:id="rId59">
+      <w:hyperlink r:id="rId63">
         <w:r>
           <w:rPr>
             <w:rStyle w:val="Hyperlink"/>
@@ -10090,8 +9975,8 @@
         </w:r>
       </w:hyperlink>
     </w:p>
-    <w:bookmarkEnd w:id="60"/>
-    <w:bookmarkStart w:id="62" w:name="ref-hajcak2010event"/>
+    <w:bookmarkEnd w:id="64"/>
+    <w:bookmarkStart w:id="66" w:name="ref-hajcak2010event"/>
     <w:p>
       <w:pPr>
         <w:pStyle w:val="Bibliography"/>
@@ -10128,7 +10013,7 @@
       <w:r>
         <w:t xml:space="preserve"> </w:t>
       </w:r>
-      <w:hyperlink r:id="rId61">
+      <w:hyperlink r:id="rId65">
         <w:r>
           <w:rPr>
             <w:rStyle w:val="Hyperlink"/>
@@ -10137,8 +10022,8 @@
         </w:r>
       </w:hyperlink>
     </w:p>
-    <w:bookmarkEnd w:id="62"/>
-    <w:bookmarkStart w:id="64" w:name="ref-healey2016four"/>
+    <w:bookmarkEnd w:id="66"/>
+    <w:bookmarkStart w:id="68" w:name="ref-healey2016four"/>
     <w:p>
       <w:pPr>
         <w:pStyle w:val="Bibliography"/>
@@ -10175,7 +10060,7 @@
       <w:r>
         <w:t xml:space="preserve"> </w:t>
       </w:r>
-      <w:hyperlink r:id="rId63">
+      <w:hyperlink r:id="rId67">
         <w:r>
           <w:rPr>
             <w:rStyle w:val="Hyperlink"/>
@@ -10184,8 +10069,8 @@
         </w:r>
       </w:hyperlink>
     </w:p>
-    <w:bookmarkEnd w:id="64"/>
-    <w:bookmarkStart w:id="66" w:name="ref-healey2019contiguity"/>
+    <w:bookmarkEnd w:id="68"/>
+    <w:bookmarkStart w:id="70" w:name="ref-healey2019contiguity"/>
     <w:p>
       <w:pPr>
         <w:pStyle w:val="Bibliography"/>
@@ -10222,7 +10107,7 @@
       <w:r>
         <w:t xml:space="preserve"> </w:t>
       </w:r>
-      <w:hyperlink r:id="rId65">
+      <w:hyperlink r:id="rId69">
         <w:r>
           <w:rPr>
             <w:rStyle w:val="Hyperlink"/>
@@ -10231,8 +10116,8 @@
         </w:r>
       </w:hyperlink>
     </w:p>
-    <w:bookmarkEnd w:id="66"/>
-    <w:bookmarkStart w:id="68" w:name="ref-howard2002distributed"/>
+    <w:bookmarkEnd w:id="70"/>
+    <w:bookmarkStart w:id="72" w:name="ref-howard2002distributed"/>
     <w:p>
       <w:pPr>
         <w:pStyle w:val="Bibliography"/>
@@ -10269,7 +10154,7 @@
       <w:r>
         <w:t xml:space="preserve"> </w:t>
       </w:r>
-      <w:hyperlink r:id="rId67">
+      <w:hyperlink r:id="rId71">
         <w:r>
           <w:rPr>
             <w:rStyle w:val="Hyperlink"/>
@@ -10278,8 +10163,8 @@
         </w:r>
       </w:hyperlink>
     </w:p>
-    <w:bookmarkEnd w:id="68"/>
-    <w:bookmarkStart w:id="70" w:name="ref-kragel2021distinct"/>
+    <w:bookmarkEnd w:id="72"/>
+    <w:bookmarkStart w:id="74" w:name="ref-kragel2021distinct"/>
     <w:p>
       <w:pPr>
         <w:pStyle w:val="Bibliography"/>
@@ -10316,7 +10201,7 @@
       <w:r>
         <w:t xml:space="preserve"> </w:t>
       </w:r>
-      <w:hyperlink r:id="rId69">
+      <w:hyperlink r:id="rId73">
         <w:r>
           <w:rPr>
             <w:rStyle w:val="Hyperlink"/>
@@ -10325,8 +10210,8 @@
         </w:r>
       </w:hyperlink>
     </w:p>
-    <w:bookmarkEnd w:id="70"/>
-    <w:bookmarkStart w:id="71" w:name="ref-lang2005international"/>
+    <w:bookmarkEnd w:id="74"/>
+    <w:bookmarkStart w:id="75" w:name="ref-lang2005international"/>
     <w:p>
       <w:pPr>
         <w:pStyle w:val="Bibliography"/>
@@ -10362,8 +10247,8 @@
         <w:t xml:space="preserve">. University of Florida.</w:t>
       </w:r>
     </w:p>
-    <w:bookmarkEnd w:id="71"/>
-    <w:bookmarkStart w:id="73" w:name="ref-lenth2024emmeans"/>
+    <w:bookmarkEnd w:id="75"/>
+    <w:bookmarkStart w:id="77" w:name="ref-lenth2024emmeans"/>
     <w:p>
       <w:pPr>
         <w:pStyle w:val="Bibliography"/>
@@ -10387,7 +10272,7 @@
       <w:r>
         <w:t xml:space="preserve"> </w:t>
       </w:r>
-      <w:hyperlink r:id="rId72">
+      <w:hyperlink r:id="rId76">
         <w:r>
           <w:rPr>
             <w:rStyle w:val="Hyperlink"/>
@@ -10396,8 +10281,8 @@
         </w:r>
       </w:hyperlink>
     </w:p>
-    <w:bookmarkEnd w:id="73"/>
-    <w:bookmarkStart w:id="75" w:name="ref-lohnas2021role"/>
+    <w:bookmarkEnd w:id="77"/>
+    <w:bookmarkStart w:id="79" w:name="ref-lohnas2021role"/>
     <w:p>
       <w:pPr>
         <w:pStyle w:val="Bibliography"/>
@@ -10424,7 +10309,7 @@
       <w:r>
         <w:t xml:space="preserve"> </w:t>
       </w:r>
-      <w:hyperlink r:id="rId74">
+      <w:hyperlink r:id="rId78">
         <w:r>
           <w:rPr>
             <w:rStyle w:val="Hyperlink"/>
@@ -10433,8 +10318,8 @@
         </w:r>
       </w:hyperlink>
     </w:p>
-    <w:bookmarkEnd w:id="75"/>
-    <w:bookmarkStart w:id="77" w:name="ref-lohnas2015expanding"/>
+    <w:bookmarkEnd w:id="79"/>
+    <w:bookmarkStart w:id="81" w:name="ref-lohnas2015expanding"/>
     <w:p>
       <w:pPr>
         <w:pStyle w:val="Bibliography"/>
@@ -10471,7 +10356,7 @@
       <w:r>
         <w:t xml:space="preserve"> </w:t>
       </w:r>
-      <w:hyperlink r:id="rId76">
+      <w:hyperlink r:id="rId80">
         <w:r>
           <w:rPr>
             <w:rStyle w:val="Hyperlink"/>
@@ -10480,8 +10365,8 @@
         </w:r>
       </w:hyperlink>
     </w:p>
-    <w:bookmarkEnd w:id="77"/>
-    <w:bookmarkStart w:id="79" w:name="ref-mackay2004emotion"/>
+    <w:bookmarkEnd w:id="81"/>
+    <w:bookmarkStart w:id="83" w:name="ref-mackay2004emotion"/>
     <w:p>
       <w:pPr>
         <w:pStyle w:val="Bibliography"/>
@@ -10527,7 +10412,7 @@
       <w:r>
         <w:t xml:space="preserve"> </w:t>
       </w:r>
-      <w:hyperlink r:id="rId78">
+      <w:hyperlink r:id="rId82">
         <w:r>
           <w:rPr>
             <w:rStyle w:val="Hyperlink"/>
@@ -10536,8 +10421,8 @@
         </w:r>
       </w:hyperlink>
     </w:p>
-    <w:bookmarkEnd w:id="79"/>
-    <w:bookmarkStart w:id="81" w:name="ref-macleod2017left"/>
+    <w:bookmarkEnd w:id="83"/>
+    <w:bookmarkStart w:id="85" w:name="ref-macleod2017left"/>
     <w:p>
       <w:pPr>
         <w:pStyle w:val="Bibliography"/>
@@ -10586,7 +10471,7 @@
       <w:r>
         <w:t xml:space="preserve"> </w:t>
       </w:r>
-      <w:hyperlink r:id="rId80">
+      <w:hyperlink r:id="rId84">
         <w:r>
           <w:rPr>
             <w:rStyle w:val="Hyperlink"/>
@@ -10595,8 +10480,8 @@
         </w:r>
       </w:hyperlink>
     </w:p>
-    <w:bookmarkEnd w:id="81"/>
-    <w:bookmarkStart w:id="83" w:name="ref-manning2011oscillatory"/>
+    <w:bookmarkEnd w:id="85"/>
+    <w:bookmarkStart w:id="87" w:name="ref-manning2011oscillatory"/>
     <w:p>
       <w:pPr>
         <w:pStyle w:val="Bibliography"/>
@@ -10633,7 +10518,7 @@
       <w:r>
         <w:t xml:space="preserve"> </w:t>
       </w:r>
-      <w:hyperlink r:id="rId82">
+      <w:hyperlink r:id="rId86">
         <w:r>
           <w:rPr>
             <w:rStyle w:val="Hyperlink"/>
@@ -10642,8 +10527,8 @@
         </w:r>
       </w:hyperlink>
     </w:p>
-    <w:bookmarkEnd w:id="83"/>
-    <w:bookmarkStart w:id="85" w:name="ref-maris2007nonparametric"/>
+    <w:bookmarkEnd w:id="87"/>
+    <w:bookmarkStart w:id="89" w:name="ref-maris2007nonparametric"/>
     <w:p>
       <w:pPr>
         <w:pStyle w:val="Bibliography"/>
@@ -10698,7 +10583,7 @@
       <w:r>
         <w:t xml:space="preserve"> </w:t>
       </w:r>
-      <w:hyperlink r:id="rId84">
+      <w:hyperlink r:id="rId88">
         <w:r>
           <w:rPr>
             <w:rStyle w:val="Hyperlink"/>
@@ -10707,8 +10592,8 @@
         </w:r>
       </w:hyperlink>
     </w:p>
-    <w:bookmarkEnd w:id="85"/>
-    <w:bookmarkStart w:id="87" w:name="ref-mather2011arousal"/>
+    <w:bookmarkEnd w:id="89"/>
+    <w:bookmarkStart w:id="91" w:name="ref-mather2011arousal"/>
     <w:p>
       <w:pPr>
         <w:pStyle w:val="Bibliography"/>
@@ -10745,7 +10630,7 @@
       <w:r>
         <w:t xml:space="preserve"> </w:t>
       </w:r>
-      <w:hyperlink r:id="rId86">
+      <w:hyperlink r:id="rId90">
         <w:r>
           <w:rPr>
             <w:rStyle w:val="Hyperlink"/>
@@ -10754,8 +10639,8 @@
         </w:r>
       </w:hyperlink>
     </w:p>
-    <w:bookmarkEnd w:id="87"/>
-    <w:bookmarkStart w:id="89" w:name="ref-moran2013psychometric"/>
+    <w:bookmarkEnd w:id="91"/>
+    <w:bookmarkStart w:id="93" w:name="ref-moran2013psychometric"/>
     <w:p>
       <w:pPr>
         <w:pStyle w:val="Bibliography"/>
@@ -10792,7 +10677,7 @@
       <w:r>
         <w:t xml:space="preserve"> </w:t>
       </w:r>
-      <w:hyperlink r:id="rId88">
+      <w:hyperlink r:id="rId92">
         <w:r>
           <w:rPr>
             <w:rStyle w:val="Hyperlink"/>
@@ -10801,8 +10686,8 @@
         </w:r>
       </w:hyperlink>
     </w:p>
-    <w:bookmarkEnd w:id="89"/>
-    <w:bookmarkStart w:id="91" w:name="ref-nolan2010faster"/>
+    <w:bookmarkEnd w:id="93"/>
+    <w:bookmarkStart w:id="95" w:name="ref-nolan2010faster"/>
     <w:p>
       <w:pPr>
         <w:pStyle w:val="Bibliography"/>
@@ -10860,7 +10745,7 @@
       <w:r>
         <w:t xml:space="preserve"> </w:t>
       </w:r>
-      <w:hyperlink r:id="rId90">
+      <w:hyperlink r:id="rId94">
         <w:r>
           <w:rPr>
             <w:rStyle w:val="Hyperlink"/>
@@ -10869,8 +10754,8 @@
         </w:r>
       </w:hyperlink>
     </w:p>
-    <w:bookmarkEnd w:id="91"/>
-    <w:bookmarkStart w:id="93" w:name="ref-olofsson2008affective"/>
+    <w:bookmarkEnd w:id="95"/>
+    <w:bookmarkStart w:id="97" w:name="ref-olofsson2008affective"/>
     <w:p>
       <w:pPr>
         <w:pStyle w:val="Bibliography"/>
@@ -10919,7 +10804,7 @@
       <w:r>
         <w:t xml:space="preserve"> </w:t>
       </w:r>
-      <w:hyperlink r:id="rId92">
+      <w:hyperlink r:id="rId96">
         <w:r>
           <w:rPr>
             <w:rStyle w:val="Hyperlink"/>
@@ -10928,8 +10813,8 @@
         </w:r>
       </w:hyperlink>
     </w:p>
-    <w:bookmarkEnd w:id="93"/>
-    <w:bookmarkStart w:id="95" w:name="ref-oostenveld2011fieldtrip"/>
+    <w:bookmarkEnd w:id="97"/>
+    <w:bookmarkStart w:id="99" w:name="ref-oostenveld2011fieldtrip"/>
     <w:p>
       <w:pPr>
         <w:pStyle w:val="Bibliography"/>
@@ -10993,7 +10878,7 @@
       <w:r>
         <w:t xml:space="preserve"> </w:t>
       </w:r>
-      <w:hyperlink r:id="rId94">
+      <w:hyperlink r:id="rId98">
         <w:r>
           <w:rPr>
             <w:rStyle w:val="Hyperlink"/>
@@ -11002,8 +10887,8 @@
         </w:r>
       </w:hyperlink>
     </w:p>
-    <w:bookmarkEnd w:id="95"/>
-    <w:bookmarkStart w:id="97" w:name="ref-polyn2005category"/>
+    <w:bookmarkEnd w:id="99"/>
+    <w:bookmarkStart w:id="101" w:name="ref-polyn2005category"/>
     <w:p>
       <w:pPr>
         <w:pStyle w:val="Bibliography"/>
@@ -11040,7 +10925,7 @@
       <w:r>
         <w:t xml:space="preserve"> </w:t>
       </w:r>
-      <w:hyperlink r:id="rId96">
+      <w:hyperlink r:id="rId100">
         <w:r>
           <w:rPr>
             <w:rStyle w:val="Hyperlink"/>
@@ -11049,8 +10934,8 @@
         </w:r>
       </w:hyperlink>
     </w:p>
-    <w:bookmarkEnd w:id="97"/>
-    <w:bookmarkStart w:id="99" w:name="ref-polyn2009context"/>
+    <w:bookmarkEnd w:id="101"/>
+    <w:bookmarkStart w:id="103" w:name="ref-polyn2009context"/>
     <w:p>
       <w:pPr>
         <w:pStyle w:val="Bibliography"/>
@@ -11087,7 +10972,7 @@
       <w:r>
         <w:t xml:space="preserve"> </w:t>
       </w:r>
-      <w:hyperlink r:id="rId98">
+      <w:hyperlink r:id="rId102">
         <w:r>
           <w:rPr>
             <w:rStyle w:val="Hyperlink"/>
@@ -11096,8 +10981,8 @@
         </w:r>
       </w:hyperlink>
     </w:p>
-    <w:bookmarkEnd w:id="99"/>
-    <w:bookmarkStart w:id="101" w:name="ref-pourtois2013brain"/>
+    <w:bookmarkEnd w:id="103"/>
+    <w:bookmarkStart w:id="105" w:name="ref-pourtois2013brain"/>
     <w:p>
       <w:pPr>
         <w:pStyle w:val="Bibliography"/>
@@ -11134,7 +11019,7 @@
       <w:r>
         <w:t xml:space="preserve"> </w:t>
       </w:r>
-      <w:hyperlink r:id="rId100">
+      <w:hyperlink r:id="rId104">
         <w:r>
           <w:rPr>
             <w:rStyle w:val="Hyperlink"/>
@@ -11143,8 +11028,8 @@
         </w:r>
       </w:hyperlink>
     </w:p>
-    <w:bookmarkEnd w:id="101"/>
-    <w:bookmarkStart w:id="103" w:name="ref-riberto2022neural"/>
+    <w:bookmarkEnd w:id="105"/>
+    <w:bookmarkStart w:id="107" w:name="ref-riberto2022neural"/>
     <w:p>
       <w:pPr>
         <w:pStyle w:val="Bibliography"/>
@@ -11181,7 +11066,7 @@
       <w:r>
         <w:t xml:space="preserve"> </w:t>
       </w:r>
-      <w:hyperlink r:id="rId102">
+      <w:hyperlink r:id="rId106">
         <w:r>
           <w:rPr>
             <w:rStyle w:val="Hyperlink"/>
@@ -11190,14 +11075,14 @@
         </w:r>
       </w:hyperlink>
     </w:p>
-    <w:bookmarkEnd w:id="103"/>
-    <w:bookmarkStart w:id="105" w:name="ref-rigoux2014bayesian"/>
+    <w:bookmarkEnd w:id="107"/>
+    <w:bookmarkStart w:id="109" w:name="ref-rosenfeld2019p300"/>
     <w:p>
       <w:pPr>
         <w:pStyle w:val="Bibliography"/>
       </w:pPr>
       <w:r>
-        <w:t xml:space="preserve">Rigoux, L., Stephan, K. E., Friston, K. J., &amp; Daunizeau, J. (2014). Bayesian model selection for group studies—revisited.</w:t>
+        <w:t xml:space="preserve">Rosenfeld, J. P. (2020). P300 in detecting concealed information and deception: A review.</w:t>
       </w:r>
       <w:r>
         <w:t xml:space="preserve"> </w:t>
@@ -11207,7 +11092,7 @@
           <w:i/>
           <w:iCs/>
         </w:rPr>
-        <w:t xml:space="preserve">NeuroImage</w:t>
+        <w:t xml:space="preserve">Psychophysiology</w:t>
       </w:r>
       <w:r>
         <w:t xml:space="preserve">,</w:t>
@@ -11220,53 +11105,6 @@
           <w:i/>
           <w:iCs/>
         </w:rPr>
-        <w:t xml:space="preserve">84</w:t>
-      </w:r>
-      <w:r>
-        <w:t xml:space="preserve">, 971–985.</w:t>
-      </w:r>
-      <w:r>
-        <w:t xml:space="preserve"> </w:t>
-      </w:r>
-      <w:hyperlink r:id="rId104">
-        <w:r>
-          <w:rPr>
-            <w:rStyle w:val="Hyperlink"/>
-          </w:rPr>
-          <w:t xml:space="preserve">https://doi.org/10.1016/j.neuroimage.2013.08.065</w:t>
-        </w:r>
-      </w:hyperlink>
-    </w:p>
-    <w:bookmarkEnd w:id="105"/>
-    <w:bookmarkStart w:id="107" w:name="ref-rosenfeld2019p300"/>
-    <w:p>
-      <w:pPr>
-        <w:pStyle w:val="Bibliography"/>
-      </w:pPr>
-      <w:r>
-        <w:t xml:space="preserve">Rosenfeld, J. P. (2020). P300 in detecting concealed information and deception: A review.</w:t>
-      </w:r>
-      <w:r>
-        <w:t xml:space="preserve"> </w:t>
-      </w:r>
-      <w:r>
-        <w:rPr>
-          <w:i/>
-          <w:iCs/>
-        </w:rPr>
-        <w:t xml:space="preserve">Psychophysiology</w:t>
-      </w:r>
-      <w:r>
-        <w:t xml:space="preserve">,</w:t>
-      </w:r>
-      <w:r>
-        <w:t xml:space="preserve"> </w:t>
-      </w:r>
-      <w:r>
-        <w:rPr>
-          <w:i/>
-          <w:iCs/>
-        </w:rPr>
         <w:t xml:space="preserve">57</w:t>
       </w:r>
       <w:r>
@@ -11275,7 +11113,7 @@
       <w:r>
         <w:t xml:space="preserve"> </w:t>
       </w:r>
-      <w:hyperlink r:id="rId106">
+      <w:hyperlink r:id="rId108">
         <w:r>
           <w:rPr>
             <w:rStyle w:val="Hyperlink"/>
@@ -11284,8 +11122,8 @@
         </w:r>
       </w:hyperlink>
     </w:p>
-    <w:bookmarkEnd w:id="107"/>
-    <w:bookmarkStart w:id="109" w:name="ref-sander2005systems"/>
+    <w:bookmarkEnd w:id="109"/>
+    <w:bookmarkStart w:id="111" w:name="ref-sander2005systems"/>
     <w:p>
       <w:pPr>
         <w:pStyle w:val="Bibliography"/>
@@ -11322,7 +11160,7 @@
       <w:r>
         <w:t xml:space="preserve"> </w:t>
       </w:r>
-      <w:hyperlink r:id="rId108">
+      <w:hyperlink r:id="rId110">
         <w:r>
           <w:rPr>
             <w:rStyle w:val="Hyperlink"/>
@@ -11331,8 +11169,8 @@
         </w:r>
       </w:hyperlink>
     </w:p>
-    <w:bookmarkEnd w:id="109"/>
-    <w:bookmarkStart w:id="111" w:name="ref-sassenhagen2019cluster"/>
+    <w:bookmarkEnd w:id="111"/>
+    <w:bookmarkStart w:id="113" w:name="ref-sassenhagen2019cluster"/>
     <w:p>
       <w:pPr>
         <w:pStyle w:val="Bibliography"/>
@@ -11387,7 +11225,7 @@
       <w:r>
         <w:t xml:space="preserve"> </w:t>
       </w:r>
-      <w:hyperlink r:id="rId110">
+      <w:hyperlink r:id="rId112">
         <w:r>
           <w:rPr>
             <w:rStyle w:val="Hyperlink"/>
@@ -11396,8 +11234,8 @@
         </w:r>
       </w:hyperlink>
     </w:p>
-    <w:bookmarkEnd w:id="111"/>
-    <w:bookmarkStart w:id="113" w:name="ref-schindler2020selective"/>
+    <w:bookmarkEnd w:id="113"/>
+    <w:bookmarkStart w:id="115" w:name="ref-schindler2020selective"/>
     <w:p>
       <w:pPr>
         <w:pStyle w:val="Bibliography"/>
@@ -11434,7 +11272,7 @@
       <w:r>
         <w:t xml:space="preserve"> </w:t>
       </w:r>
-      <w:hyperlink r:id="rId112">
+      <w:hyperlink r:id="rId114">
         <w:r>
           <w:rPr>
             <w:rStyle w:val="Hyperlink"/>
@@ -11443,8 +11281,8 @@
         </w:r>
       </w:hyperlink>
     </w:p>
-    <w:bookmarkEnd w:id="113"/>
-    <w:bookmarkStart w:id="115" w:name="ref-schupp2000affective"/>
+    <w:bookmarkEnd w:id="115"/>
+    <w:bookmarkStart w:id="117" w:name="ref-schupp2000affective"/>
     <w:p>
       <w:pPr>
         <w:pStyle w:val="Bibliography"/>
@@ -11481,7 +11319,7 @@
       <w:r>
         <w:t xml:space="preserve"> </w:t>
       </w:r>
-      <w:hyperlink r:id="rId114">
+      <w:hyperlink r:id="rId116">
         <w:r>
           <w:rPr>
             <w:rStyle w:val="Hyperlink"/>
@@ -11490,8 +11328,8 @@
         </w:r>
       </w:hyperlink>
     </w:p>
-    <w:bookmarkEnd w:id="115"/>
-    <w:bookmarkStart w:id="117" w:name="ref-schupp2006emotion"/>
+    <w:bookmarkEnd w:id="117"/>
+    <w:bookmarkStart w:id="119" w:name="ref-schupp2006emotion"/>
     <w:p>
       <w:pPr>
         <w:pStyle w:val="Bibliography"/>
@@ -11518,7 +11356,7 @@
       <w:r>
         <w:t xml:space="preserve"> </w:t>
       </w:r>
-      <w:hyperlink r:id="rId116">
+      <w:hyperlink r:id="rId118">
         <w:r>
           <w:rPr>
             <w:rStyle w:val="Hyperlink"/>
@@ -11527,8 +11365,8 @@
         </w:r>
       </w:hyperlink>
     </w:p>
-    <w:bookmarkEnd w:id="117"/>
-    <w:bookmarkStart w:id="119" w:name="ref-schupp2021case"/>
+    <w:bookmarkEnd w:id="119"/>
+    <w:bookmarkStart w:id="121" w:name="ref-schupp2021case"/>
     <w:p>
       <w:pPr>
         <w:pStyle w:val="Bibliography"/>
@@ -11586,7 +11424,7 @@
       <w:r>
         <w:t xml:space="preserve"> </w:t>
       </w:r>
-      <w:hyperlink r:id="rId118">
+      <w:hyperlink r:id="rId120">
         <w:r>
           <w:rPr>
             <w:rStyle w:val="Hyperlink"/>
@@ -11595,8 +11433,8 @@
         </w:r>
       </w:hyperlink>
     </w:p>
-    <w:bookmarkEnd w:id="119"/>
-    <w:bookmarkStart w:id="121" w:name="ref-sederberg2008context"/>
+    <w:bookmarkEnd w:id="121"/>
+    <w:bookmarkStart w:id="123" w:name="ref-sederberg2008context"/>
     <w:p>
       <w:pPr>
         <w:pStyle w:val="Bibliography"/>
@@ -11633,59 +11471,12 @@
       <w:r>
         <w:t xml:space="preserve"> </w:t>
       </w:r>
-      <w:hyperlink r:id="rId120">
+      <w:hyperlink r:id="rId122">
         <w:r>
           <w:rPr>
             <w:rStyle w:val="Hyperlink"/>
           </w:rPr>
           <w:t xml:space="preserve">https://doi.org/10.1037/a0013396</w:t>
-        </w:r>
-      </w:hyperlink>
-    </w:p>
-    <w:bookmarkEnd w:id="121"/>
-    <w:bookmarkStart w:id="123" w:name="ref-stephan2009bayesian"/>
-    <w:p>
-      <w:pPr>
-        <w:pStyle w:val="Bibliography"/>
-      </w:pPr>
-      <w:r>
-        <w:t xml:space="preserve">Stephan, K. E., Penny, W. D., Daunizeau, J., Moran, R. J., &amp; Friston, K. J. (2009). Bayesian model selection for group studies.</w:t>
-      </w:r>
-      <w:r>
-        <w:t xml:space="preserve"> </w:t>
-      </w:r>
-      <w:r>
-        <w:rPr>
-          <w:i/>
-          <w:iCs/>
-        </w:rPr>
-        <w:t xml:space="preserve">NeuroImage</w:t>
-      </w:r>
-      <w:r>
-        <w:t xml:space="preserve">,</w:t>
-      </w:r>
-      <w:r>
-        <w:t xml:space="preserve"> </w:t>
-      </w:r>
-      <w:r>
-        <w:rPr>
-          <w:i/>
-          <w:iCs/>
-        </w:rPr>
-        <w:t xml:space="preserve">46</w:t>
-      </w:r>
-      <w:r>
-        <w:t xml:space="preserve">(4), 1004–1017.</w:t>
-      </w:r>
-      <w:r>
-        <w:t xml:space="preserve"> </w:t>
-      </w:r>
-      <w:hyperlink r:id="rId122">
-        <w:r>
-          <w:rPr>
-            <w:rStyle w:val="Hyperlink"/>
-          </w:rPr>
-          <w:t xml:space="preserve">https://doi.org/10.1016/j.neuroimage.2009.03.025</w:t>
         </w:r>
       </w:hyperlink>
     </w:p>
@@ -13210,7 +13001,7 @@
         <w:br w:type="page"/>
       </w:r>
     </w:p>
-    <w:bookmarkStart w:id="145" w:name="tbl-comparison"/>
+    <w:bookmarkStart w:id="145" w:name="tbl-pooled"/>
     <w:p>
       <w:pPr>
         <w:pStyle w:val="FigureTitle"/>
@@ -13224,7 +13015,7 @@
         <w:pStyle w:val="Caption"/>
       </w:pPr>
       <w:r>
-        <w:t xml:space="preserve">Model comparison summary.</w:t>
+        <w:t xml:space="preserve">Pooled model comparison.</w:t>
       </w:r>
       <w:r>
         <w:t xml:space="preserve"> </w:t>
@@ -13238,7 +13029,7 @@
         <w:t xml:space="preserve"> </w:t>
       </w:r>
       <w:r>
-        <w:t xml:space="preserve">= free parameters; NLL = negative log-likelihood (mean</w:t>
+        <w:t xml:space="preserve">= free parameters;</w:t>
       </w:r>
       <w:r>
         <w:t xml:space="preserve"> </w:t>
@@ -13248,55 +13039,36 @@
           <m:rPr>
             <m:sty m:val="p"/>
           </m:rPr>
-          <m:t>±</m:t>
+          <m:t>−</m:t>
         </m:r>
       </m:oMath>
       <w:r>
-        <w:t xml:space="preserve"> </w:t>
-      </w:r>
-      <w:r>
-        <w:t xml:space="preserve">SE across 38 participants); AIC</w:t>
+        <w:t xml:space="preserve">LL = negative log-likelihood for a single shared parameter vector fit to all 342 trials across 38 subjects;</w:t>
+      </w:r>
+      <w:r>
+        <w:t xml:space="preserve"> </w:t>
       </w:r>
       <m:oMath>
         <m:r>
-          <m:t>w</m:t>
+          <m:t>Δ</m:t>
         </m:r>
       </m:oMath>
       <w:r>
-        <w:t xml:space="preserve"> </w:t>
-      </w:r>
-      <w:r>
-        <w:t xml:space="preserve">= aggregate AIC weight; BMS</w:t>
-      </w:r>
-      <w:r>
-        <w:t xml:space="preserve"> </w:t>
-      </w:r>
-      <m:oMath>
-        <m:r>
-          <m:t>r</m:t>
-        </m:r>
-      </m:oMath>
-      <w:r>
-        <w:t xml:space="preserve"> </w:t>
-      </w:r>
-      <w:r>
-        <w:t xml:space="preserve">= expected model frequency; BMS XP = exceedance probability.</w:t>
+        <w:t xml:space="preserve">AIC relative to best model.</w:t>
       </w:r>
     </w:p>
     <w:tbl>
       <w:tblPr>
         <w:tblStyle w:val="Table"/>
-        <w:tblW w:type="pct" w:w="5000"/>
-        <w:tblLayout w:type="fixed"/>
+        <w:tblW w:type="auto" w:w="0"/>
         <w:tblLook w:firstRow="1" w:lastRow="0" w:firstColumn="0" w:lastColumn="0" w:noHBand="0" w:noVBand="0" w:val="0020"/>
       </w:tblPr>
       <w:tblGrid>
-        <w:gridCol w:w="1200"/>
-        <w:gridCol w:w="600"/>
-        <w:gridCol w:w="2520"/>
-        <w:gridCol w:w="1560"/>
-        <w:gridCol w:w="1080"/>
-        <w:gridCol w:w="960"/>
+        <w:gridCol w:w="1584"/>
+        <w:gridCol w:w="1584"/>
+        <w:gridCol w:w="1584"/>
+        <w:gridCol w:w="1584"/>
+        <w:gridCol w:w="1584"/>
       </w:tblGrid>
       <w:tr>
         <w:trPr>
@@ -13335,22 +13107,16 @@
               <w:pStyle w:val="Compact"/>
               <w:jc w:val="center"/>
             </w:pPr>
-            <w:r>
-              <w:t xml:space="preserve">Mean NLL (</w:t>
-            </w:r>
             <m:oMath>
               <m:r>
                 <m:rPr>
                   <m:sty m:val="p"/>
                 </m:rPr>
-                <m:t>±</m:t>
+                <m:t>−</m:t>
               </m:r>
             </m:oMath>
             <w:r>
-              <w:t xml:space="preserve"> </w:t>
-            </w:r>
-            <w:r>
-              <w:t xml:space="preserve">SE)</w:t>
+              <w:t xml:space="preserve">LL</w:t>
             </w:r>
           </w:p>
         </w:tc>
@@ -13364,9 +13130,366 @@
             <w:r>
               <w:t xml:space="preserve">AIC</w:t>
             </w:r>
+          </w:p>
+        </w:tc>
+        <w:tc>
+          <w:tcPr/>
+          <w:p>
+            <w:pPr>
+              <w:pStyle w:val="Compact"/>
+              <w:jc w:val="center"/>
+            </w:pPr>
             <m:oMath>
               <m:r>
-                <m:t>w</m:t>
+                <m:t>Δ</m:t>
+              </m:r>
+            </m:oMath>
+            <w:r>
+              <w:t xml:space="preserve">AIC</w:t>
+            </w:r>
+          </w:p>
+        </w:tc>
+      </w:tr>
+      <w:tr>
+        <w:tc>
+          <w:tcPr/>
+          <w:p>
+            <w:pPr>
+              <w:pStyle w:val="Compact"/>
+              <w:jc w:val="left"/>
+            </w:pPr>
+            <w:r>
+              <w:t xml:space="preserve">CMR</w:t>
+            </w:r>
+          </w:p>
+        </w:tc>
+        <w:tc>
+          <w:tcPr/>
+          <w:p>
+            <w:pPr>
+              <w:pStyle w:val="Compact"/>
+              <w:jc w:val="center"/>
+            </w:pPr>
+            <w:r>
+              <w:t xml:space="preserve">9</w:t>
+            </w:r>
+          </w:p>
+        </w:tc>
+        <w:tc>
+          <w:tcPr/>
+          <w:p>
+            <w:pPr>
+              <w:pStyle w:val="Compact"/>
+              <w:jc w:val="center"/>
+            </w:pPr>
+            <w:r>
+              <w:t xml:space="preserve">8317.75</w:t>
+            </w:r>
+          </w:p>
+        </w:tc>
+        <w:tc>
+          <w:tcPr/>
+          <w:p>
+            <w:pPr>
+              <w:pStyle w:val="Compact"/>
+              <w:jc w:val="center"/>
+            </w:pPr>
+            <w:r>
+              <w:t xml:space="preserve">16653.51</w:t>
+            </w:r>
+          </w:p>
+        </w:tc>
+        <w:tc>
+          <w:tcPr/>
+          <w:p>
+            <w:pPr>
+              <w:pStyle w:val="Compact"/>
+              <w:jc w:val="center"/>
+            </w:pPr>
+            <w:r>
+              <w:t xml:space="preserve">+101.42</w:t>
+            </w:r>
+          </w:p>
+        </w:tc>
+      </w:tr>
+      <w:tr>
+        <w:tc>
+          <w:tcPr/>
+          <w:p>
+            <w:pPr>
+              <w:pStyle w:val="Compact"/>
+              <w:jc w:val="left"/>
+            </w:pPr>
+            <w:r>
+              <w:t xml:space="preserve">CMR+LPP</w:t>
+            </w:r>
+          </w:p>
+        </w:tc>
+        <w:tc>
+          <w:tcPr/>
+          <w:p>
+            <w:pPr>
+              <w:pStyle w:val="Compact"/>
+              <w:jc w:val="center"/>
+            </w:pPr>
+            <w:r>
+              <w:t xml:space="preserve">10</w:t>
+            </w:r>
+          </w:p>
+        </w:tc>
+        <w:tc>
+          <w:tcPr/>
+          <w:p>
+            <w:pPr>
+              <w:pStyle w:val="Compact"/>
+              <w:jc w:val="center"/>
+            </w:pPr>
+            <w:r>
+              <w:t xml:space="preserve">8308.85</w:t>
+            </w:r>
+          </w:p>
+        </w:tc>
+        <w:tc>
+          <w:tcPr/>
+          <w:p>
+            <w:pPr>
+              <w:pStyle w:val="Compact"/>
+              <w:jc w:val="center"/>
+            </w:pPr>
+            <w:r>
+              <w:t xml:space="preserve">16637.71</w:t>
+            </w:r>
+          </w:p>
+        </w:tc>
+        <w:tc>
+          <w:tcPr/>
+          <w:p>
+            <w:pPr>
+              <w:pStyle w:val="Compact"/>
+              <w:jc w:val="center"/>
+            </w:pPr>
+            <w:r>
+              <w:t xml:space="preserve">+85.62</w:t>
+            </w:r>
+          </w:p>
+        </w:tc>
+      </w:tr>
+      <w:tr>
+        <w:tc>
+          <w:tcPr/>
+          <w:p>
+            <w:pPr>
+              <w:pStyle w:val="Compact"/>
+              <w:jc w:val="left"/>
+            </w:pPr>
+            <w:r>
+              <w:t xml:space="preserve">eCMR</w:t>
+            </w:r>
+          </w:p>
+        </w:tc>
+        <w:tc>
+          <w:tcPr/>
+          <w:p>
+            <w:pPr>
+              <w:pStyle w:val="Compact"/>
+              <w:jc w:val="center"/>
+            </w:pPr>
+            <w:r>
+              <w:t xml:space="preserve">10</w:t>
+            </w:r>
+          </w:p>
+        </w:tc>
+        <w:tc>
+          <w:tcPr/>
+          <w:p>
+            <w:pPr>
+              <w:pStyle w:val="Compact"/>
+              <w:jc w:val="center"/>
+            </w:pPr>
+            <w:r>
+              <w:t xml:space="preserve">8283.13</w:t>
+            </w:r>
+          </w:p>
+        </w:tc>
+        <w:tc>
+          <w:tcPr/>
+          <w:p>
+            <w:pPr>
+              <w:pStyle w:val="Compact"/>
+              <w:jc w:val="center"/>
+            </w:pPr>
+            <w:r>
+              <w:t xml:space="preserve">16586.25</w:t>
+            </w:r>
+          </w:p>
+        </w:tc>
+        <w:tc>
+          <w:tcPr/>
+          <w:p>
+            <w:pPr>
+              <w:pStyle w:val="Compact"/>
+              <w:jc w:val="center"/>
+            </w:pPr>
+            <w:r>
+              <w:t xml:space="preserve">+34.16</w:t>
+            </w:r>
+          </w:p>
+        </w:tc>
+      </w:tr>
+      <w:tr>
+        <w:tc>
+          <w:tcPr/>
+          <w:p>
+            <w:pPr>
+              <w:pStyle w:val="Compact"/>
+              <w:jc w:val="left"/>
+            </w:pPr>
+            <w:r>
+              <w:t xml:space="preserve">LPP-eCMR</w:t>
+            </w:r>
+          </w:p>
+        </w:tc>
+        <w:tc>
+          <w:tcPr/>
+          <w:p>
+            <w:pPr>
+              <w:pStyle w:val="Compact"/>
+              <w:jc w:val="center"/>
+            </w:pPr>
+            <w:r>
+              <w:t xml:space="preserve">11</w:t>
+            </w:r>
+          </w:p>
+        </w:tc>
+        <w:tc>
+          <w:tcPr/>
+          <w:p>
+            <w:pPr>
+              <w:pStyle w:val="Compact"/>
+              <w:jc w:val="center"/>
+            </w:pPr>
+            <w:r>
+              <w:t xml:space="preserve">8265.05</w:t>
+            </w:r>
+          </w:p>
+        </w:tc>
+        <w:tc>
+          <w:tcPr/>
+          <w:p>
+            <w:pPr>
+              <w:pStyle w:val="Compact"/>
+              <w:jc w:val="center"/>
+            </w:pPr>
+            <w:r>
+              <w:t xml:space="preserve">16552.09</w:t>
+            </w:r>
+          </w:p>
+        </w:tc>
+        <w:tc>
+          <w:tcPr/>
+          <w:p>
+            <w:pPr>
+              <w:pStyle w:val="Compact"/>
+              <w:jc w:val="center"/>
+            </w:pPr>
+            <w:r>
+              <w:t xml:space="preserve">0 (best)</w:t>
+            </w:r>
+          </w:p>
+        </w:tc>
+      </w:tr>
+    </w:tbl>
+    <w:bookmarkEnd w:id="145"/>
+    <w:p>
+      <w:r>
+        <w:br w:type="page"/>
+      </w:r>
+    </w:p>
+    <w:bookmarkStart w:id="146" w:name="tbl-comparison"/>
+    <w:p>
+      <w:pPr>
+        <w:pStyle w:val="FigureTitle"/>
+      </w:pPr>
+      <w:r>
+        <w:t xml:space="preserve">Table 3</w:t>
+      </w:r>
+    </w:p>
+    <w:p>
+      <w:pPr>
+        <w:pStyle w:val="Caption"/>
+      </w:pPr>
+      <w:r>
+        <w:t xml:space="preserve">Subject-wise model comparison.</w:t>
+      </w:r>
+      <w:r>
+        <w:t xml:space="preserve"> </w:t>
+      </w:r>
+      <m:oMath>
+        <m:r>
+          <m:t>k</m:t>
+        </m:r>
+      </m:oMath>
+      <w:r>
+        <w:t xml:space="preserve"> </w:t>
+      </w:r>
+      <w:r>
+        <w:t xml:space="preserve">= free parameters; NLL = negative log-likelihood (mean</w:t>
+      </w:r>
+      <w:r>
+        <w:t xml:space="preserve"> </w:t>
+      </w:r>
+      <m:oMath>
+        <m:r>
+          <m:rPr>
+            <m:sty m:val="p"/>
+          </m:rPr>
+          <m:t>±</m:t>
+        </m:r>
+      </m:oMath>
+      <w:r>
+        <w:t xml:space="preserve"> </w:t>
+      </w:r>
+      <w:r>
+        <w:t xml:space="preserve">SE across 38 participants).</w:t>
+      </w:r>
+    </w:p>
+    <w:tbl>
+      <w:tblPr>
+        <w:tblStyle w:val="Table"/>
+        <w:tblW w:type="auto" w:w="0"/>
+        <w:tblLook w:firstRow="1" w:lastRow="0" w:firstColumn="0" w:lastColumn="0" w:noHBand="0" w:noVBand="0" w:val="0020"/>
+      </w:tblPr>
+      <w:tblGrid>
+        <w:gridCol w:w="2640"/>
+        <w:gridCol w:w="2640"/>
+        <w:gridCol w:w="2640"/>
+      </w:tblGrid>
+      <w:tr>
+        <w:trPr>
+          <w:tblHeader w:val="on"/>
+        </w:trPr>
+        <w:tc>
+          <w:tcPr/>
+          <w:p>
+            <w:pPr>
+              <w:pStyle w:val="Compact"/>
+              <w:jc w:val="left"/>
+            </w:pPr>
+            <w:r>
+              <w:t xml:space="preserve">Model</w:t>
+            </w:r>
+          </w:p>
+        </w:tc>
+        <w:tc>
+          <w:tcPr/>
+          <w:p>
+            <w:pPr>
+              <w:pStyle w:val="Compact"/>
+              <w:jc w:val="center"/>
+            </w:pPr>
+            <m:oMath>
+              <m:r>
+                <m:t>k</m:t>
               </m:r>
             </m:oMath>
           </w:p>
@@ -13379,27 +13502,21 @@
               <w:jc w:val="center"/>
             </w:pPr>
             <w:r>
-              <w:t xml:space="preserve">BMS</w:t>
+              <w:t xml:space="preserve">Mean NLL (</w:t>
             </w:r>
+            <m:oMath>
+              <m:r>
+                <m:rPr>
+                  <m:sty m:val="p"/>
+                </m:rPr>
+                <m:t>±</m:t>
+              </m:r>
+            </m:oMath>
             <w:r>
               <w:t xml:space="preserve"> </w:t>
             </w:r>
-            <m:oMath>
-              <m:r>
-                <m:t>r</m:t>
-              </m:r>
-            </m:oMath>
-          </w:p>
-        </w:tc>
-        <w:tc>
-          <w:tcPr/>
-          <w:p>
-            <w:pPr>
-              <w:pStyle w:val="Compact"/>
-              <w:jc w:val="center"/>
-            </w:pPr>
             <w:r>
-              <w:t xml:space="preserve">BMS XP</w:t>
+              <w:t xml:space="preserve">SE)</w:t>
             </w:r>
           </w:p>
         </w:tc>
@@ -13458,53 +13575,6 @@
             </w:r>
           </w:p>
         </w:tc>
-        <w:tc>
-          <w:tcPr/>
-          <w:p>
-            <w:pPr>
-              <w:pStyle w:val="Compact"/>
-              <w:jc w:val="center"/>
-            </w:pPr>
-            <m:oMath>
-              <m:r>
-                <m:rPr>
-                  <m:sty m:val="p"/>
-                </m:rPr>
-                <m:t>≈</m:t>
-              </m:r>
-            </m:oMath>
-            <w:r>
-              <w:t xml:space="preserve"> </w:t>
-            </w:r>
-            <w:r>
-              <w:t xml:space="preserve">0</w:t>
-            </w:r>
-          </w:p>
-        </w:tc>
-        <w:tc>
-          <w:tcPr/>
-          <w:p>
-            <w:pPr>
-              <w:pStyle w:val="Compact"/>
-              <w:jc w:val="center"/>
-            </w:pPr>
-            <w:r>
-              <w:t xml:space="preserve">.175</w:t>
-            </w:r>
-          </w:p>
-        </w:tc>
-        <w:tc>
-          <w:tcPr/>
-          <w:p>
-            <w:pPr>
-              <w:pStyle w:val="Compact"/>
-              <w:jc w:val="center"/>
-            </w:pPr>
-            <w:r>
-              <w:t xml:space="preserve">.009</w:t>
-            </w:r>
-          </w:p>
-        </w:tc>
       </w:tr>
       <w:tr>
         <w:tc>
@@ -13557,53 +13627,6 @@
             </w:r>
             <w:r>
               <w:t xml:space="preserve">15.73</w:t>
-            </w:r>
-          </w:p>
-        </w:tc>
-        <w:tc>
-          <w:tcPr/>
-          <w:p>
-            <w:pPr>
-              <w:pStyle w:val="Compact"/>
-              <w:jc w:val="center"/>
-            </w:pPr>
-            <m:oMath>
-              <m:r>
-                <m:rPr>
-                  <m:sty m:val="p"/>
-                </m:rPr>
-                <m:t>≈</m:t>
-              </m:r>
-            </m:oMath>
-            <w:r>
-              <w:t xml:space="preserve"> </w:t>
-            </w:r>
-            <w:r>
-              <w:t xml:space="preserve">0</w:t>
-            </w:r>
-          </w:p>
-        </w:tc>
-        <w:tc>
-          <w:tcPr/>
-          <w:p>
-            <w:pPr>
-              <w:pStyle w:val="Compact"/>
-              <w:jc w:val="center"/>
-            </w:pPr>
-            <w:r>
-              <w:t xml:space="preserve">.089</w:t>
-            </w:r>
-          </w:p>
-        </w:tc>
-        <w:tc>
-          <w:tcPr/>
-          <w:p>
-            <w:pPr>
-              <w:pStyle w:val="Compact"/>
-              <w:jc w:val="center"/>
-            </w:pPr>
-            <w:r>
-              <w:t xml:space="preserve">&lt;.001</w:t>
             </w:r>
           </w:p>
         </w:tc>
@@ -13662,42 +13685,6 @@
             </w:r>
           </w:p>
         </w:tc>
-        <w:tc>
-          <w:tcPr/>
-          <w:p>
-            <w:pPr>
-              <w:pStyle w:val="Compact"/>
-              <w:jc w:val="center"/>
-            </w:pPr>
-            <w:r>
-              <w:t xml:space="preserve">.003</w:t>
-            </w:r>
-          </w:p>
-        </w:tc>
-        <w:tc>
-          <w:tcPr/>
-          <w:p>
-            <w:pPr>
-              <w:pStyle w:val="Compact"/>
-              <w:jc w:val="center"/>
-            </w:pPr>
-            <w:r>
-              <w:t xml:space="preserve">.328</w:t>
-            </w:r>
-          </w:p>
-        </w:tc>
-        <w:tc>
-          <w:tcPr/>
-          <w:p>
-            <w:pPr>
-              <w:pStyle w:val="Compact"/>
-              <w:jc w:val="center"/>
-            </w:pPr>
-            <w:r>
-              <w:t xml:space="preserve">.269</w:t>
-            </w:r>
-          </w:p>
-        </w:tc>
       </w:tr>
       <w:tr>
         <w:tc>
@@ -13753,51 +13740,15 @@
             </w:r>
           </w:p>
         </w:tc>
-        <w:tc>
-          <w:tcPr/>
-          <w:p>
-            <w:pPr>
-              <w:pStyle w:val="Compact"/>
-              <w:jc w:val="center"/>
-            </w:pPr>
-            <w:r>
-              <w:t xml:space="preserve">.997</w:t>
-            </w:r>
-          </w:p>
-        </w:tc>
-        <w:tc>
-          <w:tcPr/>
-          <w:p>
-            <w:pPr>
-              <w:pStyle w:val="Compact"/>
-              <w:jc w:val="center"/>
-            </w:pPr>
-            <w:r>
-              <w:t xml:space="preserve">.407</w:t>
-            </w:r>
-          </w:p>
-        </w:tc>
-        <w:tc>
-          <w:tcPr/>
-          <w:p>
-            <w:pPr>
-              <w:pStyle w:val="Compact"/>
-              <w:jc w:val="center"/>
-            </w:pPr>
-            <w:r>
-              <w:t xml:space="preserve">.721</w:t>
-            </w:r>
-          </w:p>
-        </w:tc>
       </w:tr>
     </w:tbl>
-    <w:bookmarkEnd w:id="145"/>
+    <w:bookmarkEnd w:id="146"/>
     <w:p>
       <w:r>
         <w:br w:type="page"/>
       </w:r>
     </w:p>
-    <w:bookmarkStart w:id="149" w:name="fig-1"/>
+    <w:bookmarkStart w:id="150" w:name="fig-1"/>
     <w:p>
       <w:pPr>
         <w:pStyle w:val="FigureTitle"/>
@@ -13823,18 +13774,18 @@
           <wp:inline>
             <wp:extent cx="5943600" cy="4084745"/>
             <wp:effectExtent b="0" l="0" r="0" t="0"/>
-            <wp:docPr descr="" title="" id="147" name="Picture"/>
+            <wp:docPr descr="" title="" id="148" name="Picture"/>
             <a:graphic>
               <a:graphicData uri="http://schemas.openxmlformats.org/drawingml/2006/picture">
                 <pic:pic>
                   <pic:nvPicPr>
-                    <pic:cNvPr descr="figures/media/image1.png" id="148" name="Picture"/>
+                    <pic:cNvPr descr="figures/media/image1.png" id="149" name="Picture"/>
                     <pic:cNvPicPr>
                       <a:picLocks noChangeArrowheads="1" noChangeAspect="1"/>
                     </pic:cNvPicPr>
                   </pic:nvPicPr>
                   <pic:blipFill>
-                    <a:blip r:embed="rId146"/>
+                    <a:blip r:embed="rId147"/>
                     <a:stretch>
                       <a:fillRect/>
                     </a:stretch>
@@ -13861,13 +13812,13 @@
         </w:drawing>
       </w:r>
     </w:p>
-    <w:bookmarkEnd w:id="149"/>
+    <w:bookmarkEnd w:id="150"/>
     <w:p>
       <w:r>
         <w:br w:type="page"/>
       </w:r>
     </w:p>
-    <w:bookmarkStart w:id="153" w:name="fig-2"/>
+    <w:bookmarkStart w:id="154" w:name="fig-2"/>
     <w:p>
       <w:pPr>
         <w:pStyle w:val="FigureTitle"/>
@@ -13893,18 +13844,18 @@
           <wp:inline>
             <wp:extent cx="5943600" cy="4245428"/>
             <wp:effectExtent b="0" l="0" r="0" t="0"/>
-            <wp:docPr descr="" title="" id="151" name="Picture"/>
+            <wp:docPr descr="" title="" id="152" name="Picture"/>
             <a:graphic>
               <a:graphicData uri="http://schemas.openxmlformats.org/drawingml/2006/picture">
                 <pic:pic>
                   <pic:nvPicPr>
-                    <pic:cNvPr descr="figures/media/image2.png" id="152" name="Picture"/>
+                    <pic:cNvPr descr="figures/media/image2.png" id="153" name="Picture"/>
                     <pic:cNvPicPr>
                       <a:picLocks noChangeArrowheads="1" noChangeAspect="1"/>
                     </pic:cNvPicPr>
                   </pic:nvPicPr>
                   <pic:blipFill>
-                    <a:blip r:embed="rId150"/>
+                    <a:blip r:embed="rId151"/>
                     <a:stretch>
                       <a:fillRect/>
                     </a:stretch>
@@ -13931,13 +13882,13 @@
         </w:drawing>
       </w:r>
     </w:p>
-    <w:bookmarkEnd w:id="153"/>
+    <w:bookmarkEnd w:id="154"/>
     <w:p>
       <w:r>
         <w:br w:type="page"/>
       </w:r>
     </w:p>
-    <w:bookmarkStart w:id="157" w:name="fig-3"/>
+    <w:bookmarkStart w:id="158" w:name="fig-3"/>
     <w:p>
       <w:pPr>
         <w:pStyle w:val="FigureTitle"/>
@@ -13963,18 +13914,18 @@
           <wp:inline>
             <wp:extent cx="5943600" cy="4245428"/>
             <wp:effectExtent b="0" l="0" r="0" t="0"/>
-            <wp:docPr descr="" title="" id="155" name="Picture"/>
+            <wp:docPr descr="" title="" id="156" name="Picture"/>
             <a:graphic>
               <a:graphicData uri="http://schemas.openxmlformats.org/drawingml/2006/picture">
                 <pic:pic>
                   <pic:nvPicPr>
-                    <pic:cNvPr descr="figures/media/image3.png" id="156" name="Picture"/>
+                    <pic:cNvPr descr="figures/media/image3.png" id="157" name="Picture"/>
                     <pic:cNvPicPr>
                       <a:picLocks noChangeArrowheads="1" noChangeAspect="1"/>
                     </pic:cNvPicPr>
                   </pic:nvPicPr>
                   <pic:blipFill>
-                    <a:blip r:embed="rId154"/>
+                    <a:blip r:embed="rId155"/>
                     <a:stretch>
                       <a:fillRect/>
                     </a:stretch>
@@ -14001,13 +13952,13 @@
         </w:drawing>
       </w:r>
     </w:p>
-    <w:bookmarkEnd w:id="157"/>
+    <w:bookmarkEnd w:id="158"/>
     <w:p>
       <w:r>
         <w:br w:type="page"/>
       </w:r>
     </w:p>
-    <w:bookmarkStart w:id="161" w:name="fig-4"/>
+    <w:bookmarkStart w:id="162" w:name="fig-4"/>
     <w:p>
       <w:pPr>
         <w:pStyle w:val="FigureTitle"/>
@@ -14033,18 +13984,18 @@
           <wp:inline>
             <wp:extent cx="5613400" cy="2921000"/>
             <wp:effectExtent b="0" l="0" r="0" t="0"/>
-            <wp:docPr descr="" title="" id="159" name="Picture"/>
+            <wp:docPr descr="" title="" id="160" name="Picture"/>
             <a:graphic>
               <a:graphicData uri="http://schemas.openxmlformats.org/drawingml/2006/picture">
                 <pic:pic>
                   <pic:nvPicPr>
-                    <pic:cNvPr descr="figures/media/image4.png" id="160" name="Picture"/>
+                    <pic:cNvPr descr="figures/media/image4.png" id="161" name="Picture"/>
                     <pic:cNvPicPr>
                       <a:picLocks noChangeArrowheads="1" noChangeAspect="1"/>
                     </pic:cNvPicPr>
                   </pic:nvPicPr>
                   <pic:blipFill>
-                    <a:blip r:embed="rId158"/>
+                    <a:blip r:embed="rId159"/>
                     <a:stretch>
                       <a:fillRect/>
                     </a:stretch>
@@ -14071,13 +14022,13 @@
         </w:drawing>
       </w:r>
     </w:p>
-    <w:bookmarkEnd w:id="161"/>
+    <w:bookmarkEnd w:id="162"/>
     <w:p>
       <w:r>
         <w:br w:type="page"/>
       </w:r>
     </w:p>
-    <w:bookmarkStart w:id="165" w:name="fig-5"/>
+    <w:bookmarkStart w:id="166" w:name="fig-5"/>
     <w:p>
       <w:pPr>
         <w:pStyle w:val="FigureTitle"/>
@@ -14103,18 +14054,18 @@
           <wp:inline>
             <wp:extent cx="5651500" cy="7810500"/>
             <wp:effectExtent b="0" l="0" r="0" t="0"/>
-            <wp:docPr descr="" title="" id="163" name="Picture"/>
+            <wp:docPr descr="" title="" id="164" name="Picture"/>
             <a:graphic>
               <a:graphicData uri="http://schemas.openxmlformats.org/drawingml/2006/picture">
                 <pic:pic>
                   <pic:nvPicPr>
-                    <pic:cNvPr descr="figures/media/image5.png" id="164" name="Picture"/>
+                    <pic:cNvPr descr="figures/media/image5.png" id="165" name="Picture"/>
                     <pic:cNvPicPr>
                       <a:picLocks noChangeArrowheads="1" noChangeAspect="1"/>
                     </pic:cNvPicPr>
                   </pic:nvPicPr>
                   <pic:blipFill>
-                    <a:blip r:embed="rId162"/>
+                    <a:blip r:embed="rId163"/>
                     <a:stretch>
                       <a:fillRect/>
                     </a:stretch>
@@ -14141,13 +14092,13 @@
         </w:drawing>
       </w:r>
     </w:p>
-    <w:bookmarkEnd w:id="165"/>
+    <w:bookmarkEnd w:id="166"/>
     <w:p>
       <w:r>
         <w:br w:type="page"/>
       </w:r>
     </w:p>
-    <w:bookmarkStart w:id="169" w:name="fig-6"/>
+    <w:bookmarkStart w:id="170" w:name="fig-6"/>
     <w:p>
       <w:pPr>
         <w:pStyle w:val="FigureTitle"/>
@@ -14173,18 +14124,18 @@
           <wp:inline>
             <wp:extent cx="5943600" cy="3956060"/>
             <wp:effectExtent b="0" l="0" r="0" t="0"/>
-            <wp:docPr descr="" title="" id="167" name="Picture"/>
+            <wp:docPr descr="" title="" id="168" name="Picture"/>
             <a:graphic>
               <a:graphicData uri="http://schemas.openxmlformats.org/drawingml/2006/picture">
                 <pic:pic>
                   <pic:nvPicPr>
-                    <pic:cNvPr descr="figures/media/image6.png" id="168" name="Picture"/>
+                    <pic:cNvPr descr="figures/media/image6.png" id="169" name="Picture"/>
                     <pic:cNvPicPr>
                       <a:picLocks noChangeArrowheads="1" noChangeAspect="1"/>
                     </pic:cNvPicPr>
                   </pic:nvPicPr>
                   <pic:blipFill>
-                    <a:blip r:embed="rId166"/>
+                    <a:blip r:embed="rId167"/>
                     <a:stretch>
                       <a:fillRect/>
                     </a:stretch>
@@ -14211,13 +14162,13 @@
         </w:drawing>
       </w:r>
     </w:p>
-    <w:bookmarkEnd w:id="169"/>
+    <w:bookmarkEnd w:id="170"/>
     <w:p>
       <w:r>
         <w:br w:type="page"/>
       </w:r>
     </w:p>
-    <w:bookmarkStart w:id="173" w:name="fig-7"/>
+    <w:bookmarkStart w:id="174" w:name="fig-7"/>
     <w:p>
       <w:pPr>
         <w:pStyle w:val="FigureTitle"/>
@@ -14243,18 +14194,18 @@
           <wp:inline>
             <wp:extent cx="5943600" cy="4245428"/>
             <wp:effectExtent b="0" l="0" r="0" t="0"/>
-            <wp:docPr descr="" title="" id="171" name="Picture"/>
+            <wp:docPr descr="" title="" id="172" name="Picture"/>
             <a:graphic>
               <a:graphicData uri="http://schemas.openxmlformats.org/drawingml/2006/picture">
                 <pic:pic>
                   <pic:nvPicPr>
-                    <pic:cNvPr descr="figures/media/image7.png" id="172" name="Picture"/>
+                    <pic:cNvPr descr="figures/media/image7.png" id="173" name="Picture"/>
                     <pic:cNvPicPr>
                       <a:picLocks noChangeArrowheads="1" noChangeAspect="1"/>
                     </pic:cNvPicPr>
                   </pic:nvPicPr>
                   <pic:blipFill>
-                    <a:blip r:embed="rId170"/>
+                    <a:blip r:embed="rId171"/>
                     <a:stretch>
                       <a:fillRect/>
                     </a:stretch>
@@ -14281,13 +14232,13 @@
         </w:drawing>
       </w:r>
     </w:p>
-    <w:bookmarkEnd w:id="173"/>
+    <w:bookmarkEnd w:id="174"/>
     <w:p>
       <w:r>
         <w:br w:type="page"/>
       </w:r>
     </w:p>
-    <w:bookmarkStart w:id="177" w:name="fig-8"/>
+    <w:bookmarkStart w:id="178" w:name="fig-8"/>
     <w:p>
       <w:pPr>
         <w:pStyle w:val="FigureTitle"/>
@@ -14313,18 +14264,18 @@
           <wp:inline>
             <wp:extent cx="5943600" cy="5943600"/>
             <wp:effectExtent b="0" l="0" r="0" t="0"/>
-            <wp:docPr descr="" title="" id="175" name="Picture"/>
+            <wp:docPr descr="" title="" id="176" name="Picture"/>
             <a:graphic>
               <a:graphicData uri="http://schemas.openxmlformats.org/drawingml/2006/picture">
                 <pic:pic>
                   <pic:nvPicPr>
-                    <pic:cNvPr descr="figures/media/image8.png" id="176" name="Picture"/>
+                    <pic:cNvPr descr="figures/media/image8.png" id="177" name="Picture"/>
                     <pic:cNvPicPr>
                       <a:picLocks noChangeArrowheads="1" noChangeAspect="1"/>
                     </pic:cNvPicPr>
                   </pic:nvPicPr>
                   <pic:blipFill>
-                    <a:blip r:embed="rId174"/>
+                    <a:blip r:embed="rId175"/>
                     <a:stretch>
                       <a:fillRect/>
                     </a:stretch>
@@ -14351,13 +14302,13 @@
         </w:drawing>
       </w:r>
     </w:p>
-    <w:bookmarkEnd w:id="177"/>
+    <w:bookmarkEnd w:id="178"/>
     <w:p>
       <w:r>
         <w:br w:type="page"/>
       </w:r>
     </w:p>
-    <w:bookmarkStart w:id="181" w:name="fig-9"/>
+    <w:bookmarkStart w:id="182" w:name="fig-9"/>
     <w:p>
       <w:pPr>
         <w:pStyle w:val="FigureTitle"/>
@@ -14383,18 +14334,18 @@
           <wp:inline>
             <wp:extent cx="5943600" cy="5943600"/>
             <wp:effectExtent b="0" l="0" r="0" t="0"/>
-            <wp:docPr descr="" title="" id="179" name="Picture"/>
+            <wp:docPr descr="" title="" id="180" name="Picture"/>
             <a:graphic>
               <a:graphicData uri="http://schemas.openxmlformats.org/drawingml/2006/picture">
                 <pic:pic>
                   <pic:nvPicPr>
-                    <pic:cNvPr descr="figures/media/image9.png" id="180" name="Picture"/>
+                    <pic:cNvPr descr="figures/media/image9.png" id="181" name="Picture"/>
                     <pic:cNvPicPr>
                       <a:picLocks noChangeArrowheads="1" noChangeAspect="1"/>
                     </pic:cNvPicPr>
                   </pic:nvPicPr>
                   <pic:blipFill>
-                    <a:blip r:embed="rId178"/>
+                    <a:blip r:embed="rId179"/>
                     <a:stretch>
                       <a:fillRect/>
                     </a:stretch>
@@ -14421,13 +14372,13 @@
         </w:drawing>
       </w:r>
     </w:p>
-    <w:bookmarkEnd w:id="181"/>
+    <w:bookmarkEnd w:id="182"/>
     <w:p>
       <w:r>
         <w:br w:type="page"/>
       </w:r>
     </w:p>
-    <w:bookmarkStart w:id="185" w:name="fig-10"/>
+    <w:bookmarkStart w:id="186" w:name="fig-10"/>
     <w:p>
       <w:pPr>
         <w:pStyle w:val="FigureTitle"/>
@@ -14453,18 +14404,18 @@
           <wp:inline>
             <wp:extent cx="5943600" cy="4953000"/>
             <wp:effectExtent b="0" l="0" r="0" t="0"/>
-            <wp:docPr descr="" title="" id="183" name="Picture"/>
+            <wp:docPr descr="" title="" id="184" name="Picture"/>
             <a:graphic>
               <a:graphicData uri="http://schemas.openxmlformats.org/drawingml/2006/picture">
                 <pic:pic>
                   <pic:nvPicPr>
-                    <pic:cNvPr descr="figures/media/image10.png" id="184" name="Picture"/>
+                    <pic:cNvPr descr="figures/media/image10.png" id="185" name="Picture"/>
                     <pic:cNvPicPr>
                       <a:picLocks noChangeArrowheads="1" noChangeAspect="1"/>
                     </pic:cNvPicPr>
                   </pic:nvPicPr>
                   <pic:blipFill>
-                    <a:blip r:embed="rId182"/>
+                    <a:blip r:embed="rId183"/>
                     <a:stretch>
                       <a:fillRect/>
                     </a:stretch>
@@ -14491,13 +14442,13 @@
         </w:drawing>
       </w:r>
     </w:p>
-    <w:bookmarkEnd w:id="185"/>
+    <w:bookmarkEnd w:id="186"/>
     <w:p>
       <w:r>
         <w:br w:type="page"/>
       </w:r>
     </w:p>
-    <w:bookmarkStart w:id="201" w:name="fig-catspc"/>
+    <w:bookmarkStart w:id="193" w:name="fig-empirical"/>
     <w:tbl>
       <w:tblPr>
         <w:tblStyle w:val="Table"/>
@@ -14506,9 +14457,8 @@
         <w:tblLook w:firstRow="0" w:lastRow="0" w:firstColumn="0" w:lastColumn="0" w:noHBand="0" w:noVBand="0" w:val="0000"/>
       </w:tblPr>
       <w:tblGrid>
-        <w:gridCol w:w="2587"/>
-        <w:gridCol w:w="2587"/>
-        <w:gridCol w:w="2587"/>
+        <w:gridCol w:w="3880"/>
+        <w:gridCol w:w="3880"/>
       </w:tblGrid>
       <w:tr>
         <w:tc>
@@ -14521,20 +14471,20 @@
             <w:r>
               <w:drawing>
                 <wp:inline>
-                  <wp:extent cx="1975104" cy="1533059"/>
+                  <wp:extent cx="2971800" cy="2306686"/>
                   <wp:effectExtent b="0" l="0" r="0" t="0"/>
-                  <wp:docPr descr="" title="" id="187" name="Picture"/>
+                  <wp:docPr descr="" title="" id="188" name="Picture"/>
                   <a:graphic>
                     <a:graphicData uri="http://schemas.openxmlformats.org/drawingml/2006/picture">
                       <pic:pic>
                         <pic:nvPicPr>
-                          <pic:cNvPr descr="figures/analyses/reference_catspc.png" id="188" name="Picture"/>
+                          <pic:cNvPr descr="figures/analyses/reference_catspc.png" id="189" name="Picture"/>
                           <pic:cNvPicPr>
                             <a:picLocks noChangeArrowheads="1" noChangeAspect="1"/>
                           </pic:cNvPicPr>
                         </pic:nvPicPr>
                         <pic:blipFill>
-                          <a:blip r:embed="rId186"/>
+                          <a:blip r:embed="rId187"/>
                           <a:stretch>
                             <a:fillRect/>
                           </a:stretch>
@@ -14542,7 +14492,7 @@
                         <pic:spPr bwMode="auto">
                           <a:xfrm>
                             <a:off x="0" y="0"/>
-                            <a:ext cx="1975104" cy="1533059"/>
+                            <a:ext cx="2971800" cy="2306686"/>
                           </a:xfrm>
                           <a:prstGeom prst="rect">
                             <a:avLst/>
@@ -14572,20 +14522,20 @@
             <w:r>
               <w:drawing>
                 <wp:inline>
-                  <wp:extent cx="1975104" cy="1533059"/>
+                  <wp:extent cx="2971800" cy="2220220"/>
                   <wp:effectExtent b="0" l="0" r="0" t="0"/>
-                  <wp:docPr descr="" title="" id="190" name="Picture"/>
+                  <wp:docPr descr="" title="" id="191" name="Picture"/>
                   <a:graphic>
                     <a:graphicData uri="http://schemas.openxmlformats.org/drawingml/2006/picture">
                       <pic:pic>
                         <pic:nvPicPr>
-                          <pic:cNvPr descr="figures/fitting/TalmiEEG_WeirdCMRNoStop_50_set_likelihood_fixed_term_best_of_3_cat_spc.png" id="191" name="Picture"/>
+                          <pic:cNvPr descr="figures/analyses/cat_lpp_by_recall_EarlyLPP_Negative.png" id="192" name="Picture"/>
                           <pic:cNvPicPr>
                             <a:picLocks noChangeArrowheads="1" noChangeAspect="1"/>
                           </pic:cNvPicPr>
                         </pic:nvPicPr>
                         <pic:blipFill>
-                          <a:blip r:embed="rId189"/>
+                          <a:blip r:embed="rId190"/>
                           <a:stretch>
                             <a:fillRect/>
                           </a:stretch>
@@ -14593,7 +14543,95 @@
                         <pic:spPr bwMode="auto">
                           <a:xfrm>
                             <a:off x="0" y="0"/>
-                            <a:ext cx="1975104" cy="1533059"/>
+                            <a:ext cx="2971800" cy="2220220"/>
+                          </a:xfrm>
+                          <a:prstGeom prst="rect">
+                            <a:avLst/>
+                          </a:prstGeom>
+                          <a:noFill/>
+                          <a:ln w="9525">
+                            <a:noFill/>
+                            <a:headEnd/>
+                            <a:tailEnd/>
+                          </a:ln>
+                        </pic:spPr>
+                      </pic:pic>
+                    </a:graphicData>
+                  </a:graphic>
+                </wp:inline>
+              </w:drawing>
+            </w:r>
+          </w:p>
+        </w:tc>
+      </w:tr>
+    </w:tbl>
+    <w:p>
+      <w:pPr>
+        <w:pStyle w:val="FigureTitle"/>
+      </w:pPr>
+      <w:r>
+        <w:t xml:space="preserve">Figure 10</w:t>
+      </w:r>
+    </w:p>
+    <w:p>
+      <w:pPr>
+        <w:pStyle w:val="Caption"/>
+      </w:pPr>
+      <w:r>
+        <w:t xml:space="preserve">Empirical benchmark diagnostics. Left: category-specific serial position curves showing the negative-above-neutral recall advantage. Right: Early LPP amplitude by recall status for negative items showing the recalled/unrecalled separation.</w:t>
+      </w:r>
+    </w:p>
+    <w:bookmarkEnd w:id="193"/>
+    <w:p>
+      <w:r>
+        <w:br w:type="page"/>
+      </w:r>
+    </w:p>
+    <w:bookmarkStart w:id="206" w:name="fig-catspc"/>
+    <w:tbl>
+      <w:tblPr>
+        <w:tblStyle w:val="Table"/>
+        <w:tblW w:type="pct" w:w="4900"/>
+        <w:tblLayout w:type="fixed"/>
+        <w:tblLook w:firstRow="0" w:lastRow="0" w:firstColumn="0" w:lastColumn="0" w:noHBand="0" w:noVBand="0" w:val="0000"/>
+      </w:tblPr>
+      <w:tblGrid>
+        <w:gridCol w:w="3880"/>
+        <w:gridCol w:w="3880"/>
+      </w:tblGrid>
+      <w:tr>
+        <w:tc>
+          <w:tcPr/>
+          <w:p>
+            <w:pPr>
+              <w:pStyle w:val="FigureWithoutNote"/>
+              <w:jc w:val="center"/>
+            </w:pPr>
+            <w:r>
+              <w:drawing>
+                <wp:inline>
+                  <wp:extent cx="2971800" cy="2220418"/>
+                  <wp:effectExtent b="0" l="0" r="0" t="0"/>
+                  <wp:docPr descr="" title="" id="195" name="Picture"/>
+                  <a:graphic>
+                    <a:graphicData uri="http://schemas.openxmlformats.org/drawingml/2006/picture">
+                      <pic:pic>
+                        <pic:nvPicPr>
+                          <pic:cNvPr descr="figures/fitting/TalmiEEG_WeirdCMRNoStop_group_level_best_of_3_cat_spc_sim.png" id="196" name="Picture"/>
+                          <pic:cNvPicPr>
+                            <a:picLocks noChangeArrowheads="1" noChangeAspect="1"/>
+                          </pic:cNvPicPr>
+                        </pic:nvPicPr>
+                        <pic:blipFill>
+                          <a:blip r:embed="rId194"/>
+                          <a:stretch>
+                            <a:fillRect/>
+                          </a:stretch>
+                        </pic:blipFill>
+                        <pic:spPr bwMode="auto">
+                          <a:xfrm>
+                            <a:off x="0" y="0"/>
+                            <a:ext cx="2971800" cy="2220418"/>
                           </a:xfrm>
                           <a:prstGeom prst="rect">
                             <a:avLst/>
@@ -14623,20 +14661,20 @@
             <w:r>
               <w:drawing>
                 <wp:inline>
-                  <wp:extent cx="1975104" cy="1533059"/>
+                  <wp:extent cx="2971800" cy="2220418"/>
                   <wp:effectExtent b="0" l="0" r="0" t="0"/>
-                  <wp:docPr descr="" title="" id="193" name="Picture"/>
+                  <wp:docPr descr="" title="" id="198" name="Picture"/>
                   <a:graphic>
                     <a:graphicData uri="http://schemas.openxmlformats.org/drawingml/2006/picture">
                       <pic:pic>
                         <pic:nvPicPr>
-                          <pic:cNvPr descr="figures/fitting/TalmiEEG_EEGLPPParsimonious_50_set_likelihood_fixed_term_best_of_3_cat_spc.png" id="194" name="Picture"/>
+                          <pic:cNvPr descr="figures/fitting/TalmiEEG_EEGLPPParsimonious_group_level_best_of_3_cat_spc_sim.png" id="199" name="Picture"/>
                           <pic:cNvPicPr>
                             <a:picLocks noChangeArrowheads="1" noChangeAspect="1"/>
                           </pic:cNvPicPr>
                         </pic:nvPicPr>
                         <pic:blipFill>
-                          <a:blip r:embed="rId192"/>
+                          <a:blip r:embed="rId197"/>
                           <a:stretch>
                             <a:fillRect/>
                           </a:stretch>
@@ -14644,7 +14682,7 @@
                         <pic:spPr bwMode="auto">
                           <a:xfrm>
                             <a:off x="0" y="0"/>
-                            <a:ext cx="1975104" cy="1533059"/>
+                            <a:ext cx="2971800" cy="2220418"/>
                           </a:xfrm>
                           <a:prstGeom prst="rect">
                             <a:avLst/>
@@ -14693,20 +14731,20 @@
             <w:r>
               <w:drawing>
                 <wp:inline>
-                  <wp:extent cx="1975104" cy="1533059"/>
+                  <wp:extent cx="2971800" cy="2220418"/>
                   <wp:effectExtent b="0" l="0" r="0" t="0"/>
-                  <wp:docPr descr="" title="" id="196" name="Picture"/>
+                  <wp:docPr descr="" title="" id="201" name="Picture"/>
                   <a:graphic>
                     <a:graphicData uri="http://schemas.openxmlformats.org/drawingml/2006/picture">
                       <pic:pic>
                         <pic:nvPicPr>
-                          <pic:cNvPr descr="figures/fitting/TalmiEEG_eCMREmotionOnly_20260309_50_set_likelihood_best_of_3_cat_spc.png" id="197" name="Picture"/>
+                          <pic:cNvPr descr="figures/fitting/TalmiEEG_eCMREmotionOnly_group_level_best_of_3_cat_spc_sim.png" id="202" name="Picture"/>
                           <pic:cNvPicPr>
                             <a:picLocks noChangeArrowheads="1" noChangeAspect="1"/>
                           </pic:cNvPicPr>
                         </pic:nvPicPr>
                         <pic:blipFill>
-                          <a:blip r:embed="rId195"/>
+                          <a:blip r:embed="rId200"/>
                           <a:stretch>
                             <a:fillRect/>
                           </a:stretch>
@@ -14714,7 +14752,7 @@
                         <pic:spPr bwMode="auto">
                           <a:xfrm>
                             <a:off x="0" y="0"/>
-                            <a:ext cx="1975104" cy="1533059"/>
+                            <a:ext cx="2971800" cy="2220418"/>
                           </a:xfrm>
                           <a:prstGeom prst="rect">
                             <a:avLst/>
@@ -14744,20 +14782,20 @@
             <w:r>
               <w:drawing>
                 <wp:inline>
-                  <wp:extent cx="1975104" cy="1533059"/>
+                  <wp:extent cx="2971800" cy="2220418"/>
                   <wp:effectExtent b="0" l="0" r="0" t="0"/>
-                  <wp:docPr descr="" title="" id="199" name="Picture"/>
+                  <wp:docPr descr="" title="" id="204" name="Picture"/>
                   <a:graphic>
                     <a:graphicData uri="http://schemas.openxmlformats.org/drawingml/2006/picture">
                       <pic:pic>
                         <pic:nvPicPr>
-                          <pic:cNvPr descr="figures/fitting/TalmiEEG_eCMREmotionTimesLPP_20260309_50_set_likelihood_best_of_3_cat_spc.png" id="200" name="Picture"/>
+                          <pic:cNvPr descr="figures/fitting/TalmiEEG_eCMREmotionTimesLPP_group_level_best_of_3_cat_spc_sim.png" id="205" name="Picture"/>
                           <pic:cNvPicPr>
                             <a:picLocks noChangeArrowheads="1" noChangeAspect="1"/>
                           </pic:cNvPicPr>
                         </pic:nvPicPr>
                         <pic:blipFill>
-                          <a:blip r:embed="rId198"/>
+                          <a:blip r:embed="rId203"/>
                           <a:stretch>
                             <a:fillRect/>
                           </a:stretch>
@@ -14765,7 +14803,7 @@
                         <pic:spPr bwMode="auto">
                           <a:xfrm>
                             <a:off x="0" y="0"/>
-                            <a:ext cx="1975104" cy="1533059"/>
+                            <a:ext cx="2971800" cy="2220418"/>
                           </a:xfrm>
                           <a:prstGeom prst="rect">
                             <a:avLst/>
@@ -14800,16 +14838,30 @@
         <w:pStyle w:val="Caption"/>
       </w:pPr>
       <w:r>
-        <w:t xml:space="preserve">Category-specific serial position curves. Top row: empirical data, CMR, CMR+LPP. Bottom row: eCMR, LPP-eCMR. CMR predicts nearly identical curves; CMR+LPP produces a faint separation via indirect LPP–category correlation; eCMR and LPP-eCMR reproduce the full negative-above-neutral separation.</w:t>
-      </w:r>
-    </w:p>
-    <w:bookmarkEnd w:id="201"/>
+        <w:t xml:space="preserve">Simulated category-specific serial position curves. Top: CMR (left), CMR+LPP (right). Bottom: eCMR (left), LPP-eCMR (right). CMR predicts nearly identical curves; CMR+LPP produces a faint separation via indirect LPP-category correlation; eCMR and LPP-eCMR reproduce the full negative-above-neutral separation (compare</w:t>
+      </w:r>
+      <w:r>
+        <w:t xml:space="preserve"> </w:t>
+      </w:r>
+      <w:hyperlink w:anchor="fig-empirical">
+        <w:r>
+          <w:rPr>
+            <w:rStyle w:val="Hyperlink"/>
+          </w:rPr>
+          <w:t xml:space="preserve">Figure 11</w:t>
+        </w:r>
+      </w:hyperlink>
+      <w:r>
+        <w:t xml:space="preserve">).</w:t>
+      </w:r>
+    </w:p>
+    <w:bookmarkEnd w:id="206"/>
     <w:p>
       <w:r>
         <w:br w:type="page"/>
       </w:r>
     </w:p>
-    <w:bookmarkStart w:id="217" w:name="fig-lpp-recall"/>
+    <w:bookmarkStart w:id="219" w:name="fig-lpp-recall"/>
     <w:tbl>
       <w:tblPr>
         <w:tblStyle w:val="Table"/>
@@ -14818,9 +14870,8 @@
         <w:tblLook w:firstRow="0" w:lastRow="0" w:firstColumn="0" w:lastColumn="0" w:noHBand="0" w:noVBand="0" w:val="0000"/>
       </w:tblPr>
       <w:tblGrid>
-        <w:gridCol w:w="2587"/>
-        <w:gridCol w:w="2587"/>
-        <w:gridCol w:w="2587"/>
+        <w:gridCol w:w="3880"/>
+        <w:gridCol w:w="3880"/>
       </w:tblGrid>
       <w:tr>
         <w:tc>
@@ -14833,20 +14884,20 @@
             <w:r>
               <w:drawing>
                 <wp:inline>
-                  <wp:extent cx="1975104" cy="1475592"/>
+                  <wp:extent cx="2971800" cy="2220220"/>
                   <wp:effectExtent b="0" l="0" r="0" t="0"/>
-                  <wp:docPr descr="" title="" id="203" name="Picture"/>
+                  <wp:docPr descr="" title="" id="208" name="Picture"/>
                   <a:graphic>
                     <a:graphicData uri="http://schemas.openxmlformats.org/drawingml/2006/picture">
                       <pic:pic>
                         <pic:nvPicPr>
-                          <pic:cNvPr descr="figures/analyses/cat_lpp_by_recall_EarlyLPP_Negative.png" id="204" name="Picture"/>
+                          <pic:cNvPr descr="figures/fitting/TalmiEEG_WeirdCMRNoStop_group_level_best_of_3_cat_lpp_by_recall_NEGATIVE_EARLYLPP_sim.png" id="209" name="Picture"/>
                           <pic:cNvPicPr>
                             <a:picLocks noChangeArrowheads="1" noChangeAspect="1"/>
                           </pic:cNvPicPr>
                         </pic:nvPicPr>
                         <pic:blipFill>
-                          <a:blip r:embed="rId202"/>
+                          <a:blip r:embed="rId207"/>
                           <a:stretch>
                             <a:fillRect/>
                           </a:stretch>
@@ -14854,7 +14905,7 @@
                         <pic:spPr bwMode="auto">
                           <a:xfrm>
                             <a:off x="0" y="0"/>
-                            <a:ext cx="1975104" cy="1475592"/>
+                            <a:ext cx="2971800" cy="2220220"/>
                           </a:xfrm>
                           <a:prstGeom prst="rect">
                             <a:avLst/>
@@ -14884,20 +14935,20 @@
             <w:r>
               <w:drawing>
                 <wp:inline>
-                  <wp:extent cx="1975104" cy="1467063"/>
+                  <wp:extent cx="2971800" cy="2220220"/>
                   <wp:effectExtent b="0" l="0" r="0" t="0"/>
-                  <wp:docPr descr="" title="" id="206" name="Picture"/>
+                  <wp:docPr descr="" title="" id="211" name="Picture"/>
                   <a:graphic>
                     <a:graphicData uri="http://schemas.openxmlformats.org/drawingml/2006/picture">
                       <pic:pic>
                         <pic:nvPicPr>
-                          <pic:cNvPr descr="figures/fitting/TalmiEEG_WeirdCMRNoStop_50_set_likelihood_fixed_term_best_of_3_cat_lpp_by_recall_NEGATIVE_EARLYLPP.png" id="207" name="Picture"/>
+                          <pic:cNvPr descr="figures/fitting/TalmiEEG_EEGLPPParsimonious_group_level_best_of_3_cat_lpp_by_recall_NEGATIVE_EARLYLPP_sim.png" id="212" name="Picture"/>
                           <pic:cNvPicPr>
                             <a:picLocks noChangeArrowheads="1" noChangeAspect="1"/>
                           </pic:cNvPicPr>
                         </pic:nvPicPr>
                         <pic:blipFill>
-                          <a:blip r:embed="rId205"/>
+                          <a:blip r:embed="rId210"/>
                           <a:stretch>
                             <a:fillRect/>
                           </a:stretch>
@@ -14905,7 +14956,77 @@
                         <pic:spPr bwMode="auto">
                           <a:xfrm>
                             <a:off x="0" y="0"/>
-                            <a:ext cx="1975104" cy="1467063"/>
+                            <a:ext cx="2971800" cy="2220220"/>
+                          </a:xfrm>
+                          <a:prstGeom prst="rect">
+                            <a:avLst/>
+                          </a:prstGeom>
+                          <a:noFill/>
+                          <a:ln w="9525">
+                            <a:noFill/>
+                            <a:headEnd/>
+                            <a:tailEnd/>
+                          </a:ln>
+                        </pic:spPr>
+                      </pic:pic>
+                    </a:graphicData>
+                  </a:graphic>
+                </wp:inline>
+              </w:drawing>
+            </w:r>
+          </w:p>
+        </w:tc>
+      </w:tr>
+    </w:tbl>
+    <w:p>
+      <w:pPr>
+        <w:framePr w:w="0" w:h="0" w:vAnchor="margin" w:hAnchor="margin" w:xAlign="right" w:yAlign="top"/>
+      </w:pPr>
+    </w:p>
+    <w:tbl>
+      <w:tblPr>
+        <w:tblStyle w:val="Table"/>
+        <w:tblW w:type="pct" w:w="4900"/>
+        <w:tblLayout w:type="fixed"/>
+        <w:tblLook w:firstRow="0" w:lastRow="0" w:firstColumn="0" w:lastColumn="0" w:noHBand="0" w:noVBand="0" w:val="0000"/>
+      </w:tblPr>
+      <w:tblGrid>
+        <w:gridCol w:w="3880"/>
+        <w:gridCol w:w="3880"/>
+      </w:tblGrid>
+      <w:tr>
+        <w:tc>
+          <w:tcPr/>
+          <w:p>
+            <w:pPr>
+              <w:pStyle w:val="FigureWithoutNote"/>
+              <w:jc w:val="center"/>
+            </w:pPr>
+            <w:r>
+              <w:drawing>
+                <wp:inline>
+                  <wp:extent cx="2971800" cy="2220220"/>
+                  <wp:effectExtent b="0" l="0" r="0" t="0"/>
+                  <wp:docPr descr="" title="" id="214" name="Picture"/>
+                  <a:graphic>
+                    <a:graphicData uri="http://schemas.openxmlformats.org/drawingml/2006/picture">
+                      <pic:pic>
+                        <pic:nvPicPr>
+                          <pic:cNvPr descr="figures/fitting/TalmiEEG_eCMREmotionOnly_group_level_best_of_3_cat_lpp_by_recall_NEGATIVE_EARLYLPP_sim.png" id="215" name="Picture"/>
+                          <pic:cNvPicPr>
+                            <a:picLocks noChangeArrowheads="1" noChangeAspect="1"/>
+                          </pic:cNvPicPr>
+                        </pic:nvPicPr>
+                        <pic:blipFill>
+                          <a:blip r:embed="rId213"/>
+                          <a:stretch>
+                            <a:fillRect/>
+                          </a:stretch>
+                        </pic:blipFill>
+                        <pic:spPr bwMode="auto">
+                          <a:xfrm>
+                            <a:off x="0" y="0"/>
+                            <a:ext cx="2971800" cy="2220220"/>
                           </a:xfrm>
                           <a:prstGeom prst="rect">
                             <a:avLst/>
@@ -14935,20 +15056,20 @@
             <w:r>
               <w:drawing>
                 <wp:inline>
-                  <wp:extent cx="1975104" cy="1467063"/>
+                  <wp:extent cx="2971800" cy="2220220"/>
                   <wp:effectExtent b="0" l="0" r="0" t="0"/>
-                  <wp:docPr descr="" title="" id="209" name="Picture"/>
+                  <wp:docPr descr="" title="" id="217" name="Picture"/>
                   <a:graphic>
                     <a:graphicData uri="http://schemas.openxmlformats.org/drawingml/2006/picture">
                       <pic:pic>
                         <pic:nvPicPr>
-                          <pic:cNvPr descr="figures/fitting/TalmiEEG_EEGLPPParsimonious_50_set_likelihood_fixed_term_best_of_3_cat_lpp_by_recall_NEGATIVE_EARLYLPP.png" id="210" name="Picture"/>
+                          <pic:cNvPr descr="figures/fitting/TalmiEEG_eCMREmotionTimesLPP_group_level_best_of_3_cat_lpp_by_recall_NEGATIVE_EARLYLPP_sim.png" id="218" name="Picture"/>
                           <pic:cNvPicPr>
                             <a:picLocks noChangeArrowheads="1" noChangeAspect="1"/>
                           </pic:cNvPicPr>
                         </pic:nvPicPr>
                         <pic:blipFill>
-                          <a:blip r:embed="rId208"/>
+                          <a:blip r:embed="rId216"/>
                           <a:stretch>
                             <a:fillRect/>
                           </a:stretch>
@@ -14956,7 +15077,7 @@
                         <pic:spPr bwMode="auto">
                           <a:xfrm>
                             <a:off x="0" y="0"/>
-                            <a:ext cx="1975104" cy="1467063"/>
+                            <a:ext cx="2971800" cy="2220220"/>
                           </a:xfrm>
                           <a:prstGeom prst="rect">
                             <a:avLst/>
@@ -14980,127 +15101,6 @@
     </w:tbl>
     <w:p>
       <w:pPr>
-        <w:framePr w:w="0" w:h="0" w:vAnchor="margin" w:hAnchor="margin" w:xAlign="right" w:yAlign="top"/>
-      </w:pPr>
-    </w:p>
-    <w:tbl>
-      <w:tblPr>
-        <w:tblStyle w:val="Table"/>
-        <w:tblW w:type="pct" w:w="4900"/>
-        <w:tblLayout w:type="fixed"/>
-        <w:tblLook w:firstRow="0" w:lastRow="0" w:firstColumn="0" w:lastColumn="0" w:noHBand="0" w:noVBand="0" w:val="0000"/>
-      </w:tblPr>
-      <w:tblGrid>
-        <w:gridCol w:w="3880"/>
-        <w:gridCol w:w="3880"/>
-      </w:tblGrid>
-      <w:tr>
-        <w:tc>
-          <w:tcPr/>
-          <w:p>
-            <w:pPr>
-              <w:pStyle w:val="FigureWithoutNote"/>
-              <w:jc w:val="center"/>
-            </w:pPr>
-            <w:r>
-              <w:drawing>
-                <wp:inline>
-                  <wp:extent cx="1975104" cy="1467063"/>
-                  <wp:effectExtent b="0" l="0" r="0" t="0"/>
-                  <wp:docPr descr="" title="" id="212" name="Picture"/>
-                  <a:graphic>
-                    <a:graphicData uri="http://schemas.openxmlformats.org/drawingml/2006/picture">
-                      <pic:pic>
-                        <pic:nvPicPr>
-                          <pic:cNvPr descr="figures/fitting/TalmiEEG_eCMREmotionOnly_20260309_50_set_likelihood_best_of_3_cat_lpp_by_recall_NEGATIVE_EARLYLPP.png" id="213" name="Picture"/>
-                          <pic:cNvPicPr>
-                            <a:picLocks noChangeArrowheads="1" noChangeAspect="1"/>
-                          </pic:cNvPicPr>
-                        </pic:nvPicPr>
-                        <pic:blipFill>
-                          <a:blip r:embed="rId211"/>
-                          <a:stretch>
-                            <a:fillRect/>
-                          </a:stretch>
-                        </pic:blipFill>
-                        <pic:spPr bwMode="auto">
-                          <a:xfrm>
-                            <a:off x="0" y="0"/>
-                            <a:ext cx="1975104" cy="1467063"/>
-                          </a:xfrm>
-                          <a:prstGeom prst="rect">
-                            <a:avLst/>
-                          </a:prstGeom>
-                          <a:noFill/>
-                          <a:ln w="9525">
-                            <a:noFill/>
-                            <a:headEnd/>
-                            <a:tailEnd/>
-                          </a:ln>
-                        </pic:spPr>
-                      </pic:pic>
-                    </a:graphicData>
-                  </a:graphic>
-                </wp:inline>
-              </w:drawing>
-            </w:r>
-          </w:p>
-        </w:tc>
-        <w:tc>
-          <w:tcPr/>
-          <w:p>
-            <w:pPr>
-              <w:pStyle w:val="FigureWithoutNote"/>
-              <w:jc w:val="center"/>
-            </w:pPr>
-            <w:r>
-              <w:drawing>
-                <wp:inline>
-                  <wp:extent cx="1975104" cy="1467063"/>
-                  <wp:effectExtent b="0" l="0" r="0" t="0"/>
-                  <wp:docPr descr="" title="" id="215" name="Picture"/>
-                  <a:graphic>
-                    <a:graphicData uri="http://schemas.openxmlformats.org/drawingml/2006/picture">
-                      <pic:pic>
-                        <pic:nvPicPr>
-                          <pic:cNvPr descr="figures/fitting/TalmiEEG_eCMREmotionTimesLPP_20260309_50_set_likelihood_best_of_3_cat_lpp_by_recall_NEGATIVE_EARLYLPP.png" id="216" name="Picture"/>
-                          <pic:cNvPicPr>
-                            <a:picLocks noChangeArrowheads="1" noChangeAspect="1"/>
-                          </pic:cNvPicPr>
-                        </pic:nvPicPr>
-                        <pic:blipFill>
-                          <a:blip r:embed="rId214"/>
-                          <a:stretch>
-                            <a:fillRect/>
-                          </a:stretch>
-                        </pic:blipFill>
-                        <pic:spPr bwMode="auto">
-                          <a:xfrm>
-                            <a:off x="0" y="0"/>
-                            <a:ext cx="1975104" cy="1467063"/>
-                          </a:xfrm>
-                          <a:prstGeom prst="rect">
-                            <a:avLst/>
-                          </a:prstGeom>
-                          <a:noFill/>
-                          <a:ln w="9525">
-                            <a:noFill/>
-                            <a:headEnd/>
-                            <a:tailEnd/>
-                          </a:ln>
-                        </pic:spPr>
-                      </pic:pic>
-                    </a:graphicData>
-                  </a:graphic>
-                </wp:inline>
-              </w:drawing>
-            </w:r>
-          </w:p>
-        </w:tc>
-      </w:tr>
-    </w:tbl>
-    <w:p>
-      <w:pPr>
         <w:pStyle w:val="FigureTitle"/>
       </w:pPr>
       <w:r>
@@ -15112,17 +15112,31 @@
         <w:pStyle w:val="Caption"/>
       </w:pPr>
       <w:r>
-        <w:t xml:space="preserve">Early LPP amplitude by recall status for negative items. Top row: empirical data, CMR, CMR+LPP. Bottom row: eCMR, LPP-eCMR. CMR+LPP and LPP-eCMR both reproduce the recalled/unrecalled separation; CMR and eCMR cannot.</w:t>
-      </w:r>
-    </w:p>
-    <w:bookmarkEnd w:id="217"/>
+        <w:t xml:space="preserve">Simulated Early LPP amplitude by recall status for negative items. Top: CMR (left), CMR+LPP (right). Bottom: eCMR (left), LPP-eCMR (right). CMR+LPP and LPP-eCMR reproduce the recalled/unrecalled separation; CMR and eCMR cannot (compare</w:t>
+      </w:r>
+      <w:r>
+        <w:t xml:space="preserve"> </w:t>
+      </w:r>
+      <w:hyperlink w:anchor="fig-empirical">
+        <w:r>
+          <w:rPr>
+            <w:rStyle w:val="Hyperlink"/>
+          </w:rPr>
+          <w:t xml:space="preserve">Figure 11</w:t>
+        </w:r>
+      </w:hyperlink>
+      <w:r>
+        <w:t xml:space="preserve">).</w:t>
+      </w:r>
+    </w:p>
+    <w:bookmarkEnd w:id="219"/>
     <w:p>
       <w:r>
         <w:br w:type="page"/>
       </w:r>
     </w:p>
-    <w:bookmarkEnd w:id="218"/>
-    <w:bookmarkEnd w:id="219"/>
+    <w:bookmarkEnd w:id="220"/>
+    <w:bookmarkEnd w:id="221"/>
     <w:sectPr>
       <w:headerReference r:id="rId9" w:type="even"/>
       <w:headerReference r:id="rId11" w:type="default"/>

</xml_diff>

<commit_message>
refactor(analysis): rename pooled model packages
</commit_message>
<xml_diff>
--- a/docs/index.docx
+++ b/docs/index.docx
@@ -9149,7 +9149,7 @@
               <a:graphicData uri="http://schemas.openxmlformats.org/drawingml/2006/picture">
                 <pic:pic>
                   <pic:nvPicPr>
-                    <pic:cNvPr descr="work/lpp_model_prediction_grids/matched_models_recall_rate_figure.png" id="42" name="Picture"/>
+                    <pic:cNvPr descr="work/pooled_model_figures/matched_models_recall_rate_figure.png" id="42" name="Picture"/>
                     <pic:cNvPicPr>
                       <a:picLocks noChangeArrowheads="1" noChangeAspect="1"/>
                     </pic:cNvPicPr>
@@ -9219,7 +9219,7 @@
               <a:graphicData uri="http://schemas.openxmlformats.org/drawingml/2006/picture">
                 <pic:pic>
                   <pic:nvPicPr>
-                    <pic:cNvPr descr="work/lpp_model_prediction_grids/matched_models_early_lpp_figure.png" id="46" name="Picture"/>
+                    <pic:cNvPr descr="work/pooled_model_figures/matched_models_early_lpp_figure.png" id="46" name="Picture"/>
                     <pic:cNvPicPr>
                       <a:picLocks noChangeArrowheads="1" noChangeAspect="1"/>
                     </pic:cNvPicPr>

</xml_diff>